<commit_message>
testing code written in Word Doc
</commit_message>
<xml_diff>
--- a/Irrigation Test Method Description.docx
+++ b/Irrigation Test Method Description.docx
@@ -78,11 +78,6 @@
         <w:rPr>
           <w:rFonts w:cstheme="majorBidi"/>
         </w:rPr>
-      </w:r>
-      <w:r>
-        <w:rPr>
-          <w:rFonts w:cstheme="majorBidi"/>
-        </w:rPr>
         <w:fldChar w:fldCharType="separate"/>
       </w:r>
       <w:r>
@@ -185,13 +180,61 @@
         <w:rPr>
           <w:rFonts w:cstheme="majorBidi"/>
         </w:rPr>
-        <w:t>) emissions for paddy rice cultivation, changes to soil water holding capacity and changes to crop yields.</w:t>
-      </w:r>
-      <w:r>
-        <w:rPr>
-          <w:rFonts w:cstheme="majorBidi"/>
-        </w:rPr>
-        <w:t xml:space="preserve"> Aside from the energy used for pumping and distribution of irrigation, the other GHG emissions can be calculated as part of other GHG calculations such as arable cultivation.</w:t>
+        <w:t>) emissions for paddy rice cultivation, changes to soil water holding capacity</w:t>
+      </w:r>
+      <w:r>
+        <w:rPr>
+          <w:rFonts w:cstheme="majorBidi"/>
+        </w:rPr>
+        <w:t xml:space="preserve"> which influences soil organic carbon dynamics</w:t>
+      </w:r>
+      <w:r>
+        <w:rPr>
+          <w:rFonts w:cstheme="majorBidi"/>
+        </w:rPr>
+        <w:t xml:space="preserve"> and changes to crop yields</w:t>
+      </w:r>
+      <w:r>
+        <w:rPr>
+          <w:rFonts w:cstheme="majorBidi"/>
+        </w:rPr>
+        <w:t xml:space="preserve"> which influences carbon in biomass and soil carbon dynamics</w:t>
+      </w:r>
+      <w:r>
+        <w:rPr>
+          <w:rFonts w:cstheme="majorBidi"/>
+        </w:rPr>
+        <w:t>.</w:t>
+      </w:r>
+      <w:r>
+        <w:rPr>
+          <w:rFonts w:cstheme="majorBidi"/>
+        </w:rPr>
+        <w:t xml:space="preserve"> Aside from the energy used for pumping and distribution of irrigation, </w:t>
+      </w:r>
+      <w:r>
+        <w:rPr>
+          <w:rFonts w:cstheme="majorBidi"/>
+        </w:rPr>
+        <w:t xml:space="preserve">irrigation </w:t>
+      </w:r>
+      <w:r>
+        <w:rPr>
+          <w:rFonts w:cstheme="majorBidi"/>
+        </w:rPr>
+        <w:t xml:space="preserve">GHG emissions can be calculated as part of other GHG calculations such as arable </w:t>
+      </w:r>
+      <w:r>
+        <w:rPr>
+          <w:rFonts w:cstheme="majorBidi"/>
+        </w:rPr>
+        <w:t xml:space="preserve">or rice </w:t>
+      </w:r>
+      <w:r>
+        <w:rPr>
+          <w:rFonts w:cstheme="majorBidi"/>
+        </w:rPr>
+        <w:t>cultivation.</w:t>
       </w:r>
     </w:p>
     <w:p>
@@ -242,7 +285,85 @@
         <w:rPr>
           <w:rFonts w:cstheme="majorBidi"/>
         </w:rPr>
-        <w:t xml:space="preserve">The </w:t>
+        <w:t>The CO</w:t>
+      </w:r>
+      <w:r>
+        <w:rPr>
+          <w:rFonts w:cstheme="majorBidi"/>
+          <w:vertAlign w:val="subscript"/>
+        </w:rPr>
+        <w:t>2</w:t>
+      </w:r>
+      <w:r>
+        <w:rPr>
+          <w:rFonts w:cstheme="majorBidi"/>
+        </w:rPr>
+        <w:t>e</w:t>
+      </w:r>
+      <w:r>
+        <w:rPr>
+          <w:rFonts w:cstheme="majorBidi"/>
+        </w:rPr>
+        <w:t xml:space="preserve"> </w:t>
+      </w:r>
+      <w:r>
+        <w:rPr>
+          <w:rFonts w:cstheme="majorBidi"/>
+        </w:rPr>
+        <w:t>are calculated separately for each field first and then summed together to get an estimation of CO</w:t>
+      </w:r>
+      <w:r>
+        <w:rPr>
+          <w:rFonts w:cstheme="majorBidi"/>
+          <w:vertAlign w:val="subscript"/>
+        </w:rPr>
+        <w:t>2</w:t>
+      </w:r>
+      <w:r>
+        <w:rPr>
+          <w:rFonts w:cstheme="majorBidi"/>
+        </w:rPr>
+        <w:t>e</w:t>
+      </w:r>
+      <w:r>
+        <w:rPr>
+          <w:rFonts w:cstheme="majorBidi"/>
+        </w:rPr>
+        <w:t xml:space="preserve"> </w:t>
+      </w:r>
+      <w:r>
+        <w:rPr>
+          <w:rFonts w:cstheme="majorBidi"/>
+        </w:rPr>
+        <w:t>for all irrigation events</w:t>
+      </w:r>
+      <w:r>
+        <w:rPr>
+          <w:rFonts w:cstheme="majorBidi"/>
+        </w:rPr>
+        <w:t>, as shown in Table 1.</w:t>
+      </w:r>
+    </w:p>
+    <w:p>
+      <w:pPr>
+        <w:jc w:val="both"/>
+        <w:rPr>
+          <w:rFonts w:cstheme="majorBidi"/>
+        </w:rPr>
+      </w:pPr>
+      <w:r>
+        <w:rPr>
+          <w:rFonts w:cstheme="majorBidi"/>
+          <w:b/>
+          <w:bCs/>
+        </w:rPr>
+        <w:t>Table 1.</w:t>
+      </w:r>
+      <w:r>
+        <w:rPr>
+          <w:rFonts w:cstheme="majorBidi"/>
+        </w:rPr>
+        <w:t xml:space="preserve"> The output from the code, with expected values of </w:t>
       </w:r>
       <w:r>
         <w:rPr>
@@ -267,45 +388,64 @@
         <w:rPr>
           <w:rFonts w:cstheme="majorBidi"/>
         </w:rPr>
-        <w:t xml:space="preserve"> </w:t>
-      </w:r>
-      <w:r>
-        <w:rPr>
-          <w:rFonts w:cstheme="majorBidi"/>
-        </w:rPr>
-        <w:t xml:space="preserve">are calculated separately for each field first and then summed together to get an estimation of </w:t>
-      </w:r>
-      <w:r>
-        <w:rPr>
-          <w:rFonts w:cstheme="majorBidi"/>
-        </w:rPr>
-        <w:t>CO</w:t>
-      </w:r>
-      <w:r>
-        <w:rPr>
-          <w:rFonts w:cstheme="majorBidi"/>
-          <w:vertAlign w:val="subscript"/>
-        </w:rPr>
-        <w:t>2</w:t>
-      </w:r>
-      <w:r>
-        <w:rPr>
-          <w:rFonts w:cstheme="majorBidi"/>
-        </w:rPr>
-        <w:t>e</w:t>
-      </w:r>
-      <w:r>
-        <w:rPr>
-          <w:rFonts w:cstheme="majorBidi"/>
-        </w:rPr>
-        <w:t xml:space="preserve"> </w:t>
-      </w:r>
-      <w:r>
-        <w:rPr>
-          <w:rFonts w:cstheme="majorBidi"/>
-        </w:rPr>
-        <w:t xml:space="preserve">for all irrigation events. </w:t>
-      </w:r>
+        <w:t xml:space="preserve"> calculated for each irrigation event.</w:t>
+      </w:r>
+    </w:p>
+    <w:p>
+      <w:pPr>
+        <w:jc w:val="both"/>
+        <w:rPr>
+          <w:rFonts w:cstheme="majorBidi"/>
+        </w:rPr>
+      </w:pPr>
+      <w:r>
+        <w:rPr>
+          <w:rFonts w:cstheme="majorBidi"/>
+        </w:rPr>
+        <w:drawing>
+          <wp:inline distT="0" distB="0" distL="0" distR="0" wp14:anchorId="193E6E9A" wp14:editId="101F733B">
+            <wp:extent cx="5731510" cy="888365"/>
+            <wp:effectExtent l="0" t="0" r="2540" b="6985"/>
+            <wp:docPr id="1" name="Picture 1"/>
+            <wp:cNvGraphicFramePr>
+              <a:graphicFrameLocks xmlns:a="http://schemas.openxmlformats.org/drawingml/2006/main" noChangeAspect="1"/>
+            </wp:cNvGraphicFramePr>
+            <a:graphic xmlns:a="http://schemas.openxmlformats.org/drawingml/2006/main">
+              <a:graphicData uri="http://schemas.openxmlformats.org/drawingml/2006/picture">
+                <pic:pic xmlns:pic="http://schemas.openxmlformats.org/drawingml/2006/picture">
+                  <pic:nvPicPr>
+                    <pic:cNvPr id="1" name=""/>
+                    <pic:cNvPicPr/>
+                  </pic:nvPicPr>
+                  <pic:blipFill>
+                    <a:blip r:embed="rId5"/>
+                    <a:stretch>
+                      <a:fillRect/>
+                    </a:stretch>
+                  </pic:blipFill>
+                  <pic:spPr>
+                    <a:xfrm>
+                      <a:off x="0" y="0"/>
+                      <a:ext cx="5731510" cy="888365"/>
+                    </a:xfrm>
+                    <a:prstGeom prst="rect">
+                      <a:avLst/>
+                    </a:prstGeom>
+                  </pic:spPr>
+                </pic:pic>
+              </a:graphicData>
+            </a:graphic>
+          </wp:inline>
+        </w:drawing>
+      </w:r>
+    </w:p>
+    <w:p>
+      <w:pPr>
+        <w:jc w:val="both"/>
+        <w:rPr>
+          <w:rFonts w:cstheme="majorBidi"/>
+        </w:rPr>
+      </w:pPr>
       <w:r>
         <w:rPr>
           <w:rFonts w:cstheme="majorBidi"/>
@@ -488,7 +628,19 @@
         <w:rPr>
           <w:rFonts w:cstheme="majorBidi"/>
         </w:rPr>
-        <w:t>, either in mm (m x 10</w:t>
+        <w:t xml:space="preserve">, either </w:t>
+      </w:r>
+      <w:r>
+        <w:rPr>
+          <w:rFonts w:cstheme="majorBidi"/>
+        </w:rPr>
+        <w:t xml:space="preserve">as depth, </w:t>
+      </w:r>
+      <w:r>
+        <w:rPr>
+          <w:rFonts w:cstheme="majorBidi"/>
+        </w:rPr>
+        <w:t>mm (m x 10</w:t>
       </w:r>
       <w:r>
         <w:rPr>
@@ -501,7 +653,19 @@
         <w:rPr>
           <w:rFonts w:cstheme="majorBidi"/>
         </w:rPr>
-        <w:t>) or m</w:t>
+        <w:t>) or</w:t>
+      </w:r>
+      <w:r>
+        <w:rPr>
+          <w:rFonts w:cstheme="majorBidi"/>
+        </w:rPr>
+        <w:t xml:space="preserve"> volume,</w:t>
+      </w:r>
+      <w:r>
+        <w:rPr>
+          <w:rFonts w:cstheme="majorBidi"/>
+        </w:rPr>
+        <w:t xml:space="preserve"> m</w:t>
       </w:r>
       <w:r>
         <w:rPr>
@@ -533,7 +697,14 @@
         <w:rPr>
           <w:rFonts w:cstheme="majorBidi"/>
         </w:rPr>
-        <w:t xml:space="preserve">Irrigation method: drip, sprinkler or surface. This is important to disaggregate irrigation application method to achieve accurate emission factor estimations as one may differ in energy intensity compared to the other. This is important for IPCC Tier 2 and 3 methods as they require GHG calculators to disaggregate activities as much as possible to make their estimations accurate. </w:t>
+        <w:t xml:space="preserve">Irrigation method: drip, sprinkler or surface. This is important to disaggregate irrigation application method to achieve accurate emission factor estimations as one may differ in energy intensity compared to the other. This is important for IPCC Tier 2 and 3 </w:t>
+      </w:r>
+      <w:r>
+        <w:rPr>
+          <w:rFonts w:cstheme="majorBidi"/>
+        </w:rPr>
+        <w:lastRenderedPageBreak/>
+        <w:t xml:space="preserve">methods as they require GHG calculators to disaggregate activities as much as possible to make their estimations accurate. </w:t>
       </w:r>
     </w:p>
     <w:p>
@@ -777,13 +948,7 @@
         <w:rPr>
           <w:rFonts w:cstheme="majorBidi"/>
         </w:rPr>
-        <w:t xml:space="preserve">Where </w:t>
-      </w:r>
-      <w:r>
-        <w:rPr>
-          <w:rFonts w:cstheme="majorBidi"/>
-        </w:rPr>
-        <w:t>H2O</w:t>
+        <w:t>Where H2O</w:t>
       </w:r>
       <w:r>
         <w:rPr>
@@ -796,31 +961,7 @@
         <w:rPr>
           <w:rFonts w:cstheme="majorBidi"/>
         </w:rPr>
-        <w:t xml:space="preserve"> is </w:t>
-      </w:r>
-      <w:r>
-        <w:rPr>
-          <w:rFonts w:cstheme="majorBidi"/>
-        </w:rPr>
-        <w:t>the</w:t>
-      </w:r>
-      <w:r>
-        <w:rPr>
-          <w:rFonts w:cstheme="majorBidi"/>
-        </w:rPr>
-        <w:t xml:space="preserve"> depth </w:t>
-      </w:r>
-      <w:r>
-        <w:rPr>
-          <w:rFonts w:cstheme="majorBidi"/>
-        </w:rPr>
-        <w:t>of water</w:t>
-      </w:r>
-      <w:r>
-        <w:rPr>
-          <w:rFonts w:cstheme="majorBidi"/>
-        </w:rPr>
-        <w:t xml:space="preserve">, </w:t>
+        <w:t xml:space="preserve"> is the depth of water, </w:t>
       </w:r>
       <w:proofErr w:type="spellStart"/>
       <w:r>
@@ -841,49 +982,7 @@
         <w:rPr>
           <w:rFonts w:cstheme="majorBidi"/>
         </w:rPr>
-        <w:t xml:space="preserve"> is</w:t>
-      </w:r>
-      <w:r>
-        <w:rPr>
-          <w:rFonts w:cstheme="majorBidi"/>
-        </w:rPr>
-        <w:t xml:space="preserve"> the proportion of the field which is irrigated</w:t>
-      </w:r>
-      <w:r>
-        <w:rPr>
-          <w:rFonts w:cstheme="majorBidi"/>
-        </w:rPr>
-        <w:t>,</w:t>
-      </w:r>
-      <w:r>
-        <w:rPr>
-          <w:rFonts w:cstheme="majorBidi"/>
-        </w:rPr>
-        <w:t xml:space="preserve"> A</w:t>
-      </w:r>
-      <w:r>
-        <w:rPr>
-          <w:rFonts w:cstheme="majorBidi"/>
-        </w:rPr>
-        <w:t xml:space="preserve"> which is</w:t>
-      </w:r>
-      <w:r>
-        <w:rPr>
-          <w:rFonts w:cstheme="majorBidi"/>
-        </w:rPr>
-        <w:t xml:space="preserve"> the total area of the field</w:t>
-      </w:r>
-      <w:r>
-        <w:rPr>
-          <w:rFonts w:cstheme="majorBidi"/>
-        </w:rPr>
-        <w:t>,</w:t>
-      </w:r>
-      <w:r>
-        <w:rPr>
-          <w:rFonts w:cstheme="majorBidi"/>
-        </w:rPr>
-        <w:t xml:space="preserve"> and </w:t>
+        <w:t xml:space="preserve"> is the proportion of the field which is irrigated, A which is the total area of the field, and </w:t>
       </w:r>
       <w:proofErr w:type="spellStart"/>
       <w:r>
@@ -904,33 +1003,20 @@
         <w:rPr>
           <w:rFonts w:cstheme="majorBidi"/>
         </w:rPr>
-        <w:t xml:space="preserve"> which is</w:t>
-      </w:r>
-      <w:r>
-        <w:rPr>
-          <w:rFonts w:cstheme="majorBidi"/>
-        </w:rPr>
-        <w:t xml:space="preserve"> the emission factor specific to the region, method of irrigation and energy source.</w:t>
-      </w:r>
-      <w:r>
-        <w:rPr>
-          <w:rFonts w:cstheme="majorBidi"/>
-        </w:rPr>
-        <w:t xml:space="preserve"> The conversion from depth to volume is done by multiplying by 10 in the calculation.</w:t>
-      </w:r>
-    </w:p>
-    <w:p>
-      <w:pPr>
-        <w:jc w:val="both"/>
-        <w:rPr>
-          <w:rFonts w:cstheme="majorBidi"/>
-        </w:rPr>
-      </w:pPr>
-      <w:r>
-        <w:rPr>
-          <w:rFonts w:cstheme="majorBidi"/>
-        </w:rPr>
-        <w:lastRenderedPageBreak/>
+        <w:t xml:space="preserve"> which is the emission factor specific to the region, method of irrigation and energy source. The conversion from depth to volume is done by multiplying by 10 in the calculation.</w:t>
+      </w:r>
+    </w:p>
+    <w:p>
+      <w:pPr>
+        <w:jc w:val="both"/>
+        <w:rPr>
+          <w:rFonts w:cstheme="majorBidi"/>
+        </w:rPr>
+      </w:pPr>
+      <w:r>
+        <w:rPr>
+          <w:rFonts w:cstheme="majorBidi"/>
+        </w:rPr>
         <w:t xml:space="preserve">The second calculation occurs when </w:t>
       </w:r>
       <w:r>
@@ -1191,14 +1277,6 @@
         <w:jc w:val="both"/>
         <w:rPr>
           <w:rFonts w:cstheme="majorBidi"/>
-        </w:rPr>
-      </w:pPr>
-    </w:p>
-    <w:p>
-      <w:pPr>
-        <w:jc w:val="both"/>
-        <w:rPr>
-          <w:rFonts w:cstheme="majorBidi"/>
           <w:b/>
           <w:bCs/>
         </w:rPr>
@@ -1214,6 +1292,7 @@
     </w:p>
     <w:p>
       <w:pPr>
+        <w:jc w:val="both"/>
         <w:rPr>
           <w:rFonts w:cstheme="majorBidi"/>
         </w:rPr>
@@ -1229,19 +1308,62 @@
     </w:p>
     <w:p>
       <w:pPr>
-        <w:rPr>
-          <w:rFonts w:cstheme="majorBidi"/>
-        </w:rPr>
-      </w:pPr>
-      <w:r>
-        <w:rPr>
-          <w:rFonts w:cstheme="majorBidi"/>
-        </w:rPr>
-        <w:t>The code has a clear structure and readability as it is split into well defined steps. Each new line does something new, which makes it easy to follow for new readers or editors.</w:t>
-      </w:r>
-    </w:p>
-    <w:p>
-      <w:pPr>
+        <w:pStyle w:val="ListParagraph"/>
+        <w:numPr>
+          <w:ilvl w:val="0"/>
+          <w:numId w:val="2"/>
+        </w:numPr>
+        <w:jc w:val="both"/>
+        <w:rPr>
+          <w:rFonts w:cstheme="majorBidi"/>
+        </w:rPr>
+      </w:pPr>
+      <w:r>
+        <w:rPr>
+          <w:rFonts w:cstheme="majorBidi"/>
+        </w:rPr>
+        <w:t xml:space="preserve">The code has a clear structure and readability as it is split into well defined steps. Each new line does something new, which makes it easy to follow </w:t>
+      </w:r>
+      <w:r>
+        <w:rPr>
+          <w:rFonts w:cstheme="majorBidi"/>
+        </w:rPr>
+        <w:t xml:space="preserve">and edit </w:t>
+      </w:r>
+      <w:r>
+        <w:rPr>
+          <w:rFonts w:cstheme="majorBidi"/>
+        </w:rPr>
+        <w:t>for new readers or editors.</w:t>
+      </w:r>
+    </w:p>
+    <w:p>
+      <w:pPr>
+        <w:pStyle w:val="ListParagraph"/>
+        <w:numPr>
+          <w:ilvl w:val="0"/>
+          <w:numId w:val="2"/>
+        </w:numPr>
+        <w:jc w:val="both"/>
+        <w:rPr>
+          <w:rFonts w:cstheme="majorBidi"/>
+        </w:rPr>
+      </w:pPr>
+      <w:r>
+        <w:rPr>
+          <w:rFonts w:cstheme="majorBidi"/>
+        </w:rPr>
+        <w:t>Variable names are somewhat clear – sometimes it is useful to type them out fully such as area.</w:t>
+      </w:r>
+    </w:p>
+    <w:p>
+      <w:pPr>
+        <w:pStyle w:val="ListParagraph"/>
+        <w:numPr>
+          <w:ilvl w:val="0"/>
+          <w:numId w:val="3"/>
+        </w:numPr>
+        <w:jc w:val="both"/>
         <w:rPr>
           <w:rFonts w:cstheme="majorBidi"/>
         </w:rPr>
@@ -1258,9 +1380,69 @@
         </w:rPr>
         <w:t xml:space="preserve">user measurements of irrigation e.g., depth vs volume. </w:t>
       </w:r>
-    </w:p>
-    <w:p>
-      <w:pPr>
+      <w:r>
+        <w:rPr>
+          <w:rFonts w:cstheme="majorBidi"/>
+        </w:rPr>
+        <w:t xml:space="preserve">However, the </w:t>
+      </w:r>
+      <w:r>
+        <w:rPr>
+          <w:rFonts w:cstheme="majorBidi"/>
+        </w:rPr>
+        <w:t xml:space="preserve">list is not exhausted and there could be </w:t>
+      </w:r>
+      <w:r>
+        <w:rPr>
+          <w:rFonts w:cstheme="majorBidi"/>
+        </w:rPr>
+        <w:t>further conversion</w:t>
+      </w:r>
+      <w:r>
+        <w:rPr>
+          <w:rFonts w:cstheme="majorBidi"/>
+        </w:rPr>
+        <w:t>s</w:t>
+      </w:r>
+      <w:r>
+        <w:rPr>
+          <w:rFonts w:cstheme="majorBidi"/>
+        </w:rPr>
+        <w:t xml:space="preserve"> need</w:t>
+      </w:r>
+      <w:r>
+        <w:rPr>
+          <w:rFonts w:cstheme="majorBidi"/>
+        </w:rPr>
+        <w:t>ed</w:t>
+      </w:r>
+      <w:r>
+        <w:rPr>
+          <w:rFonts w:cstheme="majorBidi"/>
+        </w:rPr>
+        <w:t xml:space="preserve"> if a user has measured their irrigation as volume per day or depth per hour</w:t>
+      </w:r>
+      <w:r>
+        <w:rPr>
+          <w:rFonts w:cstheme="majorBidi"/>
+        </w:rPr>
+        <w:t>, for example.</w:t>
+      </w:r>
+      <w:r>
+        <w:rPr>
+          <w:rFonts w:cstheme="majorBidi"/>
+        </w:rPr>
+        <w:t xml:space="preserve"> </w:t>
+      </w:r>
+    </w:p>
+    <w:p>
+      <w:pPr>
+        <w:pStyle w:val="ListParagraph"/>
+        <w:numPr>
+          <w:ilvl w:val="0"/>
+          <w:numId w:val="3"/>
+        </w:numPr>
+        <w:jc w:val="both"/>
         <w:rPr>
           <w:rFonts w:cstheme="majorBidi"/>
         </w:rPr>
@@ -1281,11 +1463,119 @@
         <w:rPr>
           <w:rFonts w:cstheme="majorBidi"/>
         </w:rPr>
-        <w:t xml:space="preserve">as it considers the different methods of irrigation, the varying energy sources and considers region-specific parameters. </w:t>
-      </w:r>
-    </w:p>
-    <w:p>
-      <w:pPr>
+        <w:t>as it considers the different methods of irrigation, the varying energy sources and considers region-specific parameters.</w:t>
+      </w:r>
+      <w:r>
+        <w:rPr>
+          <w:rFonts w:cstheme="majorBidi"/>
+        </w:rPr>
+        <w:t xml:space="preserve"> </w:t>
+      </w:r>
+      <w:r>
+        <w:rPr>
+          <w:rFonts w:cstheme="majorBidi"/>
+        </w:rPr>
+        <w:t>However, the list is not exhaustive and there may be users who have different power supplies or methods of irrigation.</w:t>
+      </w:r>
+    </w:p>
+    <w:p>
+      <w:pPr>
+        <w:pStyle w:val="ListParagraph"/>
+        <w:numPr>
+          <w:ilvl w:val="0"/>
+          <w:numId w:val="2"/>
+        </w:numPr>
+        <w:jc w:val="both"/>
+        <w:rPr>
+          <w:rFonts w:cstheme="majorBidi"/>
+        </w:rPr>
+      </w:pPr>
+      <w:r>
+        <w:rPr>
+          <w:rFonts w:cstheme="majorBidi"/>
+        </w:rPr>
+        <w:t xml:space="preserve">The layout of the code </w:t>
+      </w:r>
+      <w:r>
+        <w:rPr>
+          <w:rFonts w:cstheme="majorBidi"/>
+        </w:rPr>
+        <w:t>is a scalable design</w:t>
+      </w:r>
+      <w:r>
+        <w:rPr>
+          <w:rFonts w:cstheme="majorBidi"/>
+        </w:rPr>
+        <w:t xml:space="preserve"> and means that it would be simple to add in more power sources or extend to other regions, for example.</w:t>
+      </w:r>
+    </w:p>
+    <w:p>
+      <w:pPr>
+        <w:pStyle w:val="ListParagraph"/>
+        <w:numPr>
+          <w:ilvl w:val="0"/>
+          <w:numId w:val="2"/>
+        </w:numPr>
+        <w:jc w:val="both"/>
+        <w:rPr>
+          <w:rFonts w:cstheme="majorBidi"/>
+        </w:rPr>
+      </w:pPr>
+      <w:r>
+        <w:rPr>
+          <w:rFonts w:cstheme="majorBidi"/>
+        </w:rPr>
+        <w:t>Good t</w:t>
+      </w:r>
+      <w:r>
+        <w:rPr>
+          <w:rFonts w:cstheme="majorBidi"/>
+        </w:rPr>
+        <w:t xml:space="preserve">ransparency as assumptions </w:t>
+      </w:r>
+      <w:proofErr w:type="gramStart"/>
+      <w:r>
+        <w:rPr>
+          <w:rFonts w:cstheme="majorBidi"/>
+        </w:rPr>
+        <w:t>are</w:t>
+      </w:r>
+      <w:proofErr w:type="gramEnd"/>
+      <w:r>
+        <w:rPr>
+          <w:rFonts w:cstheme="majorBidi"/>
+        </w:rPr>
+        <w:t xml:space="preserve"> documented throughout the code</w:t>
+      </w:r>
+      <w:r>
+        <w:rPr>
+          <w:rFonts w:cstheme="majorBidi"/>
+        </w:rPr>
+        <w:t>.</w:t>
+      </w:r>
+    </w:p>
+    <w:p>
+      <w:pPr>
+        <w:pStyle w:val="ListParagraph"/>
+        <w:numPr>
+          <w:ilvl w:val="0"/>
+          <w:numId w:val="2"/>
+        </w:numPr>
+        <w:jc w:val="both"/>
+        <w:rPr>
+          <w:rFonts w:cstheme="majorBidi"/>
+        </w:rPr>
+      </w:pPr>
+      <w:r>
+        <w:rPr>
+          <w:rFonts w:cstheme="majorBidi"/>
+        </w:rPr>
+        <w:t>Manual test of model outputs at the end checks to ensure the function is calculating what we expect, however, this is only suitable for one specific case and we need tests that could be applied throughout method development.</w:t>
+      </w:r>
+    </w:p>
+    <w:p>
+      <w:pPr>
+        <w:jc w:val="both"/>
         <w:rPr>
           <w:rFonts w:cstheme="majorBidi"/>
           <w:i/>
@@ -1303,22 +1593,157 @@
     </w:p>
     <w:p>
       <w:pPr>
-        <w:rPr>
-          <w:rFonts w:cstheme="majorBidi"/>
-        </w:rPr>
-      </w:pPr>
-    </w:p>
-    <w:p>
-      <w:pPr>
-        <w:rPr>
-          <w:rFonts w:cstheme="majorBidi"/>
-        </w:rPr>
-      </w:pPr>
-      <w:r>
-        <w:rPr>
-          <w:rFonts w:cstheme="majorBidi"/>
-        </w:rPr>
-        <w:t>However, this list is not exhausted and there could be issues if a user has measured their irrigation as volume per day or depth per hour.</w:t>
+        <w:pStyle w:val="ListParagraph"/>
+        <w:numPr>
+          <w:ilvl w:val="0"/>
+          <w:numId w:val="3"/>
+        </w:numPr>
+        <w:jc w:val="both"/>
+        <w:rPr>
+          <w:rFonts w:cstheme="majorBidi"/>
+        </w:rPr>
+      </w:pPr>
+      <w:r>
+        <w:rPr>
+          <w:rFonts w:cstheme="majorBidi"/>
+        </w:rPr>
+        <w:t xml:space="preserve">The conversion factor of in the </w:t>
+      </w:r>
+      <w:proofErr w:type="spellStart"/>
+      <w:r>
+        <w:rPr>
+          <w:rFonts w:cstheme="majorBidi"/>
+        </w:rPr>
+        <w:t>Irrigation_emiss_fun</w:t>
+      </w:r>
+      <w:proofErr w:type="spellEnd"/>
+      <w:r>
+        <w:rPr>
+          <w:rFonts w:cstheme="majorBidi"/>
+        </w:rPr>
+        <w:t xml:space="preserve"> needs to be named instead of simply typing 10.</w:t>
+      </w:r>
+      <w:r>
+        <w:rPr>
+          <w:rFonts w:cstheme="majorBidi"/>
+        </w:rPr>
+        <w:t xml:space="preserve"> Could be ‘convert_mm_m3 = 10’.</w:t>
+      </w:r>
+    </w:p>
+    <w:p>
+      <w:pPr>
+        <w:pStyle w:val="ListParagraph"/>
+        <w:numPr>
+          <w:ilvl w:val="0"/>
+          <w:numId w:val="3"/>
+        </w:numPr>
+        <w:jc w:val="both"/>
+        <w:rPr>
+          <w:rFonts w:cstheme="majorBidi"/>
+        </w:rPr>
+      </w:pPr>
+      <w:proofErr w:type="spellStart"/>
+      <w:r>
+        <w:rPr>
+          <w:rFonts w:cstheme="majorBidi"/>
+        </w:rPr>
+        <w:lastRenderedPageBreak/>
+        <w:t>A_irri</w:t>
+      </w:r>
+      <w:proofErr w:type="spellEnd"/>
+      <w:r>
+        <w:rPr>
+          <w:rFonts w:cstheme="majorBidi"/>
+        </w:rPr>
+        <w:t xml:space="preserve"> name is somewhat unclear, could rename to </w:t>
+      </w:r>
+      <w:proofErr w:type="spellStart"/>
+      <w:r>
+        <w:rPr>
+          <w:rFonts w:cstheme="majorBidi"/>
+        </w:rPr>
+        <w:t>prop_irrigated</w:t>
+      </w:r>
+      <w:proofErr w:type="spellEnd"/>
+      <w:r>
+        <w:rPr>
+          <w:rFonts w:cstheme="majorBidi"/>
+        </w:rPr>
+        <w:t xml:space="preserve"> as it is a proportion and not an area.</w:t>
+      </w:r>
+    </w:p>
+    <w:p>
+      <w:pPr>
+        <w:pStyle w:val="ListParagraph"/>
+        <w:numPr>
+          <w:ilvl w:val="0"/>
+          <w:numId w:val="3"/>
+        </w:numPr>
+        <w:jc w:val="both"/>
+        <w:rPr>
+          <w:rFonts w:cstheme="majorBidi"/>
+        </w:rPr>
+      </w:pPr>
+      <w:r>
+        <w:rPr>
+          <w:rFonts w:cstheme="majorBidi"/>
+        </w:rPr>
+        <w:t>Error messages could be used if irrigation amount is too high.</w:t>
+      </w:r>
+    </w:p>
+    <w:p>
+      <w:pPr>
+        <w:pStyle w:val="ListParagraph"/>
+        <w:numPr>
+          <w:ilvl w:val="0"/>
+          <w:numId w:val="3"/>
+        </w:numPr>
+        <w:jc w:val="both"/>
+        <w:rPr>
+          <w:rFonts w:cstheme="majorBidi"/>
+        </w:rPr>
+      </w:pPr>
+      <w:r>
+        <w:rPr>
+          <w:rFonts w:cstheme="majorBidi"/>
+        </w:rPr>
+        <w:t xml:space="preserve">Conversion factors for area would be good to include in a table so that users can provide their field area and the model converts it to ha. This would result in fewer user errors for area conversions. Also, an error message for </w:t>
+      </w:r>
+      <w:r>
+        <w:rPr>
+          <w:rFonts w:cstheme="majorBidi"/>
+        </w:rPr>
+        <w:t xml:space="preserve">area </w:t>
+      </w:r>
+      <w:r>
+        <w:rPr>
+          <w:rFonts w:cstheme="majorBidi"/>
+        </w:rPr>
+        <w:t>equal to</w:t>
+      </w:r>
+      <w:r>
+        <w:rPr>
+          <w:rFonts w:cstheme="majorBidi"/>
+        </w:rPr>
+        <w:t xml:space="preserve"> 0 or </w:t>
+      </w:r>
+      <w:r>
+        <w:rPr>
+          <w:rFonts w:cstheme="majorBidi"/>
+        </w:rPr>
+        <w:t xml:space="preserve">a </w:t>
+      </w:r>
+      <w:r>
+        <w:rPr>
+          <w:rFonts w:cstheme="majorBidi"/>
+        </w:rPr>
+        <w:t>negative</w:t>
+      </w:r>
+      <w:r>
+        <w:rPr>
+          <w:rFonts w:cstheme="majorBidi"/>
+        </w:rPr>
+        <w:t xml:space="preserve"> value or a</w:t>
       </w:r>
       <w:r>
         <w:rPr>
@@ -1326,18 +1751,1658 @@
         </w:rPr>
         <w:t xml:space="preserve"> </w:t>
       </w:r>
-    </w:p>
-    <w:p>
-      <w:pPr>
-        <w:rPr>
-          <w:rFonts w:cstheme="majorBidi"/>
-        </w:rPr>
-      </w:pPr>
-      <w:r>
-        <w:rPr>
-          <w:rFonts w:cstheme="majorBidi"/>
-        </w:rPr>
-        <w:t>However, the list is not exhaustive and there may be users who have different power supplies or methods of irrigation.</w:t>
+      <w:r>
+        <w:rPr>
+          <w:rFonts w:cstheme="majorBidi"/>
+        </w:rPr>
+        <w:t>large area size</w:t>
+      </w:r>
+      <w:r>
+        <w:rPr>
+          <w:rFonts w:cstheme="majorBidi"/>
+        </w:rPr>
+        <w:t xml:space="preserve"> (</w:t>
+      </w:r>
+      <w:r>
+        <w:rPr>
+          <w:rFonts w:cstheme="majorBidi"/>
+        </w:rPr>
+        <w:t>e.g., field sizes larger than 1 x 10</w:t>
+      </w:r>
+      <w:r>
+        <w:rPr>
+          <w:rFonts w:cstheme="majorBidi"/>
+          <w:vertAlign w:val="superscript"/>
+        </w:rPr>
+        <w:t>8</w:t>
+      </w:r>
+      <w:r>
+        <w:rPr>
+          <w:rFonts w:cstheme="majorBidi"/>
+        </w:rPr>
+        <w:t xml:space="preserve"> ha</w:t>
+      </w:r>
+      <w:r>
+        <w:rPr>
+          <w:rFonts w:cstheme="majorBidi"/>
+        </w:rPr>
+        <w:t>) would be good to have.</w:t>
+      </w:r>
+    </w:p>
+    <w:p>
+      <w:pPr>
+        <w:pStyle w:val="ListParagraph"/>
+        <w:numPr>
+          <w:ilvl w:val="0"/>
+          <w:numId w:val="3"/>
+        </w:numPr>
+        <w:jc w:val="both"/>
+        <w:rPr>
+          <w:rFonts w:cstheme="majorBidi"/>
+        </w:rPr>
+      </w:pPr>
+      <w:r>
+        <w:rPr>
+          <w:rFonts w:cstheme="majorBidi"/>
+        </w:rPr>
+        <w:t xml:space="preserve">A class </w:t>
+      </w:r>
+      <w:r>
+        <w:rPr>
+          <w:rFonts w:cstheme="majorBidi"/>
+        </w:rPr>
+        <w:t xml:space="preserve">in a config file </w:t>
+      </w:r>
+      <w:r>
+        <w:rPr>
+          <w:rFonts w:cstheme="majorBidi"/>
+        </w:rPr>
+        <w:t xml:space="preserve">could be set up which allows the user to define the area of irrigation, area of the assessment, method of irrigation, region of irrigation, </w:t>
+      </w:r>
+      <w:r>
+        <w:rPr>
+          <w:rFonts w:cstheme="majorBidi"/>
+        </w:rPr>
+        <w:t xml:space="preserve">units of irrigation (depth or volume), and power supply (electricity, diesel). This </w:t>
+      </w:r>
+      <w:r>
+        <w:rPr>
+          <w:rFonts w:cstheme="majorBidi"/>
+        </w:rPr>
+        <w:t xml:space="preserve">could be named as config and </w:t>
+      </w:r>
+      <w:r>
+        <w:rPr>
+          <w:rFonts w:cstheme="majorBidi"/>
+        </w:rPr>
+        <w:t>would make it easier for</w:t>
+      </w:r>
+      <w:r>
+        <w:rPr>
+          <w:rFonts w:cstheme="majorBidi"/>
+        </w:rPr>
+        <w:t xml:space="preserve"> the user to change their inputs</w:t>
+      </w:r>
+      <w:r>
+        <w:rPr>
+          <w:rFonts w:cstheme="majorBidi"/>
+        </w:rPr>
+        <w:t xml:space="preserve"> instead of commenting out unused sections</w:t>
+      </w:r>
+      <w:r>
+        <w:rPr>
+          <w:rFonts w:cstheme="majorBidi"/>
+        </w:rPr>
+        <w:t xml:space="preserve">. Could </w:t>
+      </w:r>
+      <w:r>
+        <w:rPr>
+          <w:rFonts w:cstheme="majorBidi"/>
+        </w:rPr>
+        <w:t>instead</w:t>
+      </w:r>
+      <w:r>
+        <w:rPr>
+          <w:rFonts w:cstheme="majorBidi"/>
+        </w:rPr>
+        <w:t xml:space="preserve"> make a dictionary </w:t>
+      </w:r>
+      <w:r>
+        <w:rPr>
+          <w:rFonts w:cstheme="majorBidi"/>
+        </w:rPr>
+        <w:t xml:space="preserve">with the user inputs </w:t>
+      </w:r>
+      <w:r>
+        <w:rPr>
+          <w:rFonts w:cstheme="majorBidi"/>
+        </w:rPr>
+        <w:t>which would be JSON compatible.</w:t>
+      </w:r>
+    </w:p>
+    <w:p>
+      <w:pPr>
+        <w:pStyle w:val="ListParagraph"/>
+        <w:numPr>
+          <w:ilvl w:val="0"/>
+          <w:numId w:val="3"/>
+        </w:numPr>
+        <w:jc w:val="both"/>
+        <w:rPr>
+          <w:rFonts w:cstheme="majorBidi"/>
+        </w:rPr>
+      </w:pPr>
+      <w:r>
+        <w:rPr>
+          <w:rFonts w:cstheme="majorBidi"/>
+        </w:rPr>
+        <w:t xml:space="preserve">The function </w:t>
+      </w:r>
+      <w:proofErr w:type="spellStart"/>
+      <w:r>
+        <w:rPr>
+          <w:rFonts w:cstheme="majorBidi"/>
+        </w:rPr>
+        <w:t>Irrig_emiss_fun</w:t>
+      </w:r>
+      <w:proofErr w:type="spellEnd"/>
+      <w:r>
+        <w:rPr>
+          <w:rFonts w:cstheme="majorBidi"/>
+        </w:rPr>
+        <w:t xml:space="preserve"> could be generalised using if, </w:t>
+      </w:r>
+      <w:proofErr w:type="spellStart"/>
+      <w:r>
+        <w:rPr>
+          <w:rFonts w:cstheme="majorBidi"/>
+        </w:rPr>
+        <w:t>elif</w:t>
+      </w:r>
+      <w:proofErr w:type="spellEnd"/>
+      <w:r>
+        <w:rPr>
+          <w:rFonts w:cstheme="majorBidi"/>
+        </w:rPr>
+        <w:t xml:space="preserve"> and else conditional statements to distinguish between the use of depth and volume in irrigation units.</w:t>
+      </w:r>
+    </w:p>
+    <w:p>
+      <w:pPr>
+        <w:pStyle w:val="ListParagraph"/>
+        <w:numPr>
+          <w:ilvl w:val="0"/>
+          <w:numId w:val="3"/>
+        </w:numPr>
+        <w:jc w:val="both"/>
+        <w:rPr>
+          <w:rFonts w:cstheme="majorBidi"/>
+        </w:rPr>
+      </w:pPr>
+      <w:r>
+        <w:rPr>
+          <w:rFonts w:cstheme="majorBidi"/>
+        </w:rPr>
+        <w:t xml:space="preserve">It would be good to write this as a package so that the function is reusable in other scripts and we can test each step easily. I would do this by writing a utils script that reads in the tables and builds the model input </w:t>
+      </w:r>
+      <w:proofErr w:type="spellStart"/>
+      <w:r>
+        <w:rPr>
+          <w:rFonts w:cstheme="majorBidi"/>
+        </w:rPr>
+        <w:t>dataframe</w:t>
+      </w:r>
+      <w:proofErr w:type="spellEnd"/>
+      <w:r>
+        <w:rPr>
+          <w:rFonts w:cstheme="majorBidi"/>
+        </w:rPr>
+        <w:t xml:space="preserve"> from the separate config file described above. Then there could be the core model script with the functions for irrigation emission calculations. Finally, we could have separate file for model tests, which are detailed in the sub-heading below.</w:t>
+      </w:r>
+    </w:p>
+    <w:p>
+      <w:pPr>
+        <w:pStyle w:val="ListParagraph"/>
+        <w:numPr>
+          <w:ilvl w:val="0"/>
+          <w:numId w:val="3"/>
+        </w:numPr>
+        <w:jc w:val="both"/>
+        <w:rPr>
+          <w:rFonts w:cstheme="majorBidi"/>
+        </w:rPr>
+      </w:pPr>
+      <w:r>
+        <w:rPr>
+          <w:rFonts w:cstheme="majorBidi"/>
+        </w:rPr>
+        <w:t>Data visualisation would be good to add, this could be a simple table or bar chart graph.</w:t>
+      </w:r>
+    </w:p>
+    <w:p>
+      <w:pPr>
+        <w:pStyle w:val="ListParagraph"/>
+        <w:numPr>
+          <w:ilvl w:val="0"/>
+          <w:numId w:val="3"/>
+        </w:numPr>
+        <w:jc w:val="both"/>
+        <w:rPr>
+          <w:rFonts w:cstheme="majorBidi"/>
+        </w:rPr>
+      </w:pPr>
+      <w:r>
+        <w:rPr>
+          <w:rFonts w:cstheme="majorBidi"/>
+        </w:rPr>
+        <w:t>Uncertainty estimations would be good to add, there is the assumption that surface, drip and sprinkler applications are even across the whole field – this could be quite dynamic depending on wind or temperature.</w:t>
+      </w:r>
+    </w:p>
+    <w:p>
+      <w:pPr>
+        <w:jc w:val="both"/>
+        <w:rPr>
+          <w:rFonts w:cstheme="majorBidi"/>
+          <w:i/>
+          <w:iCs/>
+        </w:rPr>
+      </w:pPr>
+      <w:r>
+        <w:rPr>
+          <w:rFonts w:cstheme="majorBidi"/>
+          <w:i/>
+          <w:iCs/>
+        </w:rPr>
+        <w:t>Tests</w:t>
+      </w:r>
+    </w:p>
+    <w:p>
+      <w:pPr>
+        <w:jc w:val="both"/>
+        <w:rPr>
+          <w:rFonts w:cstheme="majorBidi"/>
+        </w:rPr>
+      </w:pPr>
+      <w:r>
+        <w:rPr>
+          <w:rFonts w:cstheme="majorBidi"/>
+        </w:rPr>
+        <w:t xml:space="preserve">Tests can be done using </w:t>
+      </w:r>
+      <w:proofErr w:type="spellStart"/>
+      <w:r>
+        <w:rPr>
+          <w:rFonts w:cstheme="majorBidi"/>
+        </w:rPr>
+        <w:t>pytest</w:t>
+      </w:r>
+      <w:proofErr w:type="spellEnd"/>
+      <w:r>
+        <w:rPr>
+          <w:rFonts w:cstheme="majorBidi"/>
+        </w:rPr>
+        <w:t>.</w:t>
+      </w:r>
+    </w:p>
+    <w:p>
+      <w:pPr>
+        <w:pStyle w:val="ListParagraph"/>
+        <w:numPr>
+          <w:ilvl w:val="0"/>
+          <w:numId w:val="4"/>
+        </w:numPr>
+        <w:rPr>
+          <w:rFonts w:cstheme="majorBidi"/>
+        </w:rPr>
+      </w:pPr>
+      <w:r>
+        <w:rPr>
+          <w:rFonts w:cstheme="majorBidi"/>
+        </w:rPr>
+        <w:t>Test 1: if area is 0</w:t>
+      </w:r>
+      <w:r>
+        <w:rPr>
+          <w:rFonts w:cstheme="majorBidi"/>
+        </w:rPr>
+        <w:t xml:space="preserve"> then emissions should be 0 or error message.</w:t>
+      </w:r>
+    </w:p>
+    <w:p>
+      <w:pPr>
+        <w:pStyle w:val="ListParagraph"/>
+        <w:numPr>
+          <w:ilvl w:val="0"/>
+          <w:numId w:val="4"/>
+        </w:numPr>
+        <w:rPr>
+          <w:rFonts w:cstheme="majorBidi"/>
+        </w:rPr>
+      </w:pPr>
+      <w:r>
+        <w:rPr>
+          <w:rFonts w:cstheme="majorBidi"/>
+        </w:rPr>
+        <w:t>Test 2: if irrigation volume or depth is 0 or negative, the code should return an error message or the emissions should be 0.</w:t>
+      </w:r>
+    </w:p>
+    <w:p>
+      <w:pPr>
+        <w:pStyle w:val="ListParagraph"/>
+        <w:numPr>
+          <w:ilvl w:val="0"/>
+          <w:numId w:val="4"/>
+        </w:numPr>
+        <w:rPr>
+          <w:rFonts w:cstheme="majorBidi"/>
+        </w:rPr>
+      </w:pPr>
+      <w:r>
+        <w:rPr>
+          <w:rFonts w:cstheme="majorBidi"/>
+        </w:rPr>
+        <w:t xml:space="preserve">Test 3: </w:t>
+      </w:r>
+      <w:r>
+        <w:rPr>
+          <w:rFonts w:cstheme="majorBidi"/>
+        </w:rPr>
+        <w:t>conversion factor should only work if irrigation unit is ‘mm’.</w:t>
+      </w:r>
+    </w:p>
+    <w:p>
+      <w:pPr>
+        <w:pStyle w:val="ListParagraph"/>
+        <w:numPr>
+          <w:ilvl w:val="0"/>
+          <w:numId w:val="4"/>
+        </w:numPr>
+        <w:rPr>
+          <w:rFonts w:cstheme="majorBidi"/>
+        </w:rPr>
+      </w:pPr>
+      <w:r>
+        <w:rPr>
+          <w:rFonts w:cstheme="majorBidi"/>
+        </w:rPr>
+        <w:t>Test 4: empty arrays should return an empty output</w:t>
+      </w:r>
+    </w:p>
+    <w:p>
+      <w:pPr>
+        <w:pStyle w:val="ListParagraph"/>
+        <w:numPr>
+          <w:ilvl w:val="0"/>
+          <w:numId w:val="4"/>
+        </w:numPr>
+        <w:rPr>
+          <w:rFonts w:cstheme="majorBidi"/>
+        </w:rPr>
+      </w:pPr>
+      <w:r>
+        <w:rPr>
+          <w:rFonts w:cstheme="majorBidi"/>
+        </w:rPr>
+        <w:t>Test 5: user inputs should be valid, e.g., power source can only be diesel or electricity currently.</w:t>
+      </w:r>
+    </w:p>
+    <w:p>
+      <w:pPr>
+        <w:pStyle w:val="ListParagraph"/>
+        <w:numPr>
+          <w:ilvl w:val="0"/>
+          <w:numId w:val="4"/>
+        </w:numPr>
+        <w:rPr>
+          <w:rFonts w:cstheme="majorBidi"/>
+        </w:rPr>
+      </w:pPr>
+      <w:r>
+        <w:rPr>
+          <w:rFonts w:cstheme="majorBidi"/>
+        </w:rPr>
+        <w:t>Test 6: check big picture, is the function giving us what we expect to see and the units are correct – this can be done with dummy data and manual calculations.</w:t>
+      </w:r>
+    </w:p>
+    <w:p>
+      <w:pPr>
+        <w:jc w:val="both"/>
+        <w:rPr>
+          <w:rFonts w:cstheme="majorBidi"/>
+          <w:b/>
+          <w:bCs/>
+        </w:rPr>
+      </w:pPr>
+    </w:p>
+    <w:p>
+      <w:pPr>
+        <w:jc w:val="both"/>
+        <w:rPr>
+          <w:rFonts w:cstheme="majorBidi"/>
+          <w:b/>
+          <w:bCs/>
+        </w:rPr>
+      </w:pPr>
+      <w:r>
+        <w:rPr>
+          <w:rFonts w:cstheme="majorBidi"/>
+          <w:b/>
+          <w:bCs/>
+        </w:rPr>
+        <w:t>Process Explanation</w:t>
+      </w:r>
+    </w:p>
+    <w:p>
+      <w:pPr>
+        <w:jc w:val="both"/>
+        <w:rPr>
+          <w:rFonts w:cstheme="majorBidi"/>
+        </w:rPr>
+      </w:pPr>
+      <w:r>
+        <w:rPr>
+          <w:rFonts w:cstheme="majorBidi"/>
+        </w:rPr>
+        <w:t>Initially, I read through the script line by line</w:t>
+      </w:r>
+      <w:r>
+        <w:rPr>
+          <w:rFonts w:cstheme="majorBidi"/>
+        </w:rPr>
+        <w:t xml:space="preserve"> to be familiar with the method and the overall objective of the code. My next step was to run the code, after setting up the script in my working directory. After reviewing the output of the code, I was able to clearly see what the </w:t>
+      </w:r>
+      <w:r>
+        <w:rPr>
+          <w:rFonts w:cstheme="majorBidi"/>
+        </w:rPr>
+        <w:t>code</w:t>
+      </w:r>
+      <w:r>
+        <w:rPr>
+          <w:rFonts w:cstheme="majorBidi"/>
+        </w:rPr>
+        <w:t xml:space="preserve"> was </w:t>
+      </w:r>
+      <w:r>
+        <w:rPr>
+          <w:rFonts w:cstheme="majorBidi"/>
+        </w:rPr>
+        <w:lastRenderedPageBreak/>
+        <w:t xml:space="preserve">doing. </w:t>
+      </w:r>
+      <w:r>
+        <w:rPr>
+          <w:rFonts w:cstheme="majorBidi"/>
+        </w:rPr>
+        <w:t>From there, I started writing up my thoughts and able to think about the changes and tests I would implement</w:t>
+      </w:r>
+      <w:r>
+        <w:rPr>
+          <w:rFonts w:cstheme="majorBidi"/>
+        </w:rPr>
+        <w:t>.</w:t>
+      </w:r>
+      <w:r>
+        <w:rPr>
+          <w:rFonts w:cstheme="majorBidi"/>
+        </w:rPr>
+        <w:t xml:space="preserve"> </w:t>
+      </w:r>
+    </w:p>
+    <w:p>
+      <w:pPr>
+        <w:jc w:val="both"/>
+        <w:rPr>
+          <w:rFonts w:cstheme="majorBidi"/>
+        </w:rPr>
+      </w:pPr>
+      <w:r>
+        <w:rPr>
+          <w:rFonts w:cstheme="majorBidi"/>
+        </w:rPr>
+        <w:t>I then tested the code by changing the user inputs to:</w:t>
+      </w:r>
+    </w:p>
+    <w:p>
+      <w:pPr>
+        <w:jc w:val="both"/>
+        <w:rPr>
+          <w:rFonts w:cstheme="majorBidi"/>
+          <w:i/>
+          <w:iCs/>
+        </w:rPr>
+      </w:pPr>
+      <w:r>
+        <w:rPr>
+          <w:rFonts w:cstheme="majorBidi"/>
+          <w:i/>
+          <w:iCs/>
+        </w:rPr>
+        <w:t>Test 1</w:t>
+      </w:r>
+      <w:r>
+        <w:rPr>
+          <w:rFonts w:cstheme="majorBidi"/>
+          <w:i/>
+          <w:iCs/>
+        </w:rPr>
+        <w:t xml:space="preserve"> – testing 0 value for area</w:t>
+      </w:r>
+    </w:p>
+    <w:p>
+      <w:pPr>
+        <w:jc w:val="both"/>
+        <w:rPr>
+          <w:rFonts w:cstheme="majorBidi"/>
+        </w:rPr>
+      </w:pPr>
+      <w:r>
+        <w:rPr>
+          <w:rFonts w:cstheme="majorBidi"/>
+        </w:rPr>
+        <w:t>‘</w:t>
+      </w:r>
+      <w:proofErr w:type="spellStart"/>
+      <w:r>
+        <w:rPr>
+          <w:rFonts w:cstheme="majorBidi"/>
+        </w:rPr>
+        <w:t>A_irri</w:t>
+      </w:r>
+      <w:proofErr w:type="spellEnd"/>
+      <w:r>
+        <w:rPr>
+          <w:rFonts w:cstheme="majorBidi"/>
+        </w:rPr>
+        <w:t xml:space="preserve">’ = </w:t>
+      </w:r>
+      <w:r>
+        <w:rPr>
+          <w:rFonts w:cstheme="majorBidi"/>
+        </w:rPr>
+        <w:t>0 # area is 0 so emissions should be 0</w:t>
+      </w:r>
+    </w:p>
+    <w:p>
+      <w:pPr>
+        <w:jc w:val="both"/>
+        <w:rPr>
+          <w:rFonts w:cstheme="majorBidi"/>
+        </w:rPr>
+      </w:pPr>
+      <w:r>
+        <w:rPr>
+          <w:rFonts w:cstheme="majorBidi"/>
+        </w:rPr>
+        <w:t>‘A’ = 10</w:t>
+      </w:r>
+    </w:p>
+    <w:p>
+      <w:pPr>
+        <w:jc w:val="both"/>
+        <w:rPr>
+          <w:rFonts w:cstheme="majorBidi"/>
+        </w:rPr>
+      </w:pPr>
+      <w:r>
+        <w:rPr>
+          <w:rFonts w:cstheme="majorBidi"/>
+        </w:rPr>
+        <w:t>‘</w:t>
+      </w:r>
+      <w:proofErr w:type="spellStart"/>
+      <w:r>
+        <w:rPr>
+          <w:rFonts w:cstheme="majorBidi"/>
+        </w:rPr>
+        <w:t>Method_irri</w:t>
+      </w:r>
+      <w:proofErr w:type="spellEnd"/>
+      <w:r>
+        <w:rPr>
+          <w:rFonts w:cstheme="majorBidi"/>
+        </w:rPr>
+        <w:t>’ = “Drip”</w:t>
+      </w:r>
+      <w:r>
+        <w:rPr>
+          <w:rFonts w:cstheme="majorBidi"/>
+        </w:rPr>
+        <w:t xml:space="preserve"> # change in method</w:t>
+      </w:r>
+      <w:r>
+        <w:rPr>
+          <w:rFonts w:cstheme="majorBidi"/>
+        </w:rPr>
+        <w:t xml:space="preserve"> to ensure it accepts other methods</w:t>
+      </w:r>
+    </w:p>
+    <w:p>
+      <w:pPr>
+        <w:jc w:val="both"/>
+        <w:rPr>
+          <w:rFonts w:cstheme="majorBidi"/>
+        </w:rPr>
+      </w:pPr>
+      <w:r>
+        <w:rPr>
+          <w:rFonts w:cstheme="majorBidi"/>
+        </w:rPr>
+        <w:t>‘</w:t>
+      </w:r>
+      <w:proofErr w:type="spellStart"/>
+      <w:r>
+        <w:rPr>
+          <w:rFonts w:cstheme="majorBidi"/>
+        </w:rPr>
+        <w:t>Region_irri</w:t>
+      </w:r>
+      <w:proofErr w:type="spellEnd"/>
+      <w:r>
+        <w:rPr>
+          <w:rFonts w:cstheme="majorBidi"/>
+        </w:rPr>
+        <w:t>’ = “AR U”</w:t>
+      </w:r>
+      <w:r>
+        <w:rPr>
+          <w:rFonts w:cstheme="majorBidi"/>
+        </w:rPr>
+        <w:t xml:space="preserve"> # change in region</w:t>
+      </w:r>
+      <w:r>
+        <w:rPr>
+          <w:rFonts w:cstheme="majorBidi"/>
+        </w:rPr>
+        <w:t xml:space="preserve"> </w:t>
+      </w:r>
+      <w:r>
+        <w:rPr>
+          <w:rFonts w:cstheme="majorBidi"/>
+        </w:rPr>
+        <w:t xml:space="preserve">to ensure it accepts other </w:t>
+      </w:r>
+      <w:r>
+        <w:rPr>
+          <w:rFonts w:cstheme="majorBidi"/>
+        </w:rPr>
+        <w:t>regions</w:t>
+      </w:r>
+    </w:p>
+    <w:p>
+      <w:pPr>
+        <w:jc w:val="both"/>
+        <w:rPr>
+          <w:rFonts w:cstheme="majorBidi"/>
+        </w:rPr>
+      </w:pPr>
+      <w:r>
+        <w:rPr>
+          <w:rFonts w:cstheme="majorBidi"/>
+        </w:rPr>
+        <w:t>‘</w:t>
+      </w:r>
+      <w:proofErr w:type="spellStart"/>
+      <w:proofErr w:type="gramStart"/>
+      <w:r>
+        <w:rPr>
+          <w:rFonts w:cstheme="majorBidi"/>
+        </w:rPr>
+        <w:t>irrigation</w:t>
+      </w:r>
+      <w:proofErr w:type="gramEnd"/>
+      <w:r>
+        <w:rPr>
+          <w:rFonts w:cstheme="majorBidi"/>
+        </w:rPr>
+        <w:t>_meas_unit</w:t>
+      </w:r>
+      <w:proofErr w:type="spellEnd"/>
+      <w:r>
+        <w:rPr>
+          <w:rFonts w:cstheme="majorBidi"/>
+        </w:rPr>
+        <w:t>’ = “m</w:t>
+      </w:r>
+      <w:r>
+        <w:rPr>
+          <w:rFonts w:cstheme="majorBidi"/>
+        </w:rPr>
+        <w:t>3</w:t>
+      </w:r>
+      <w:r>
+        <w:rPr>
+          <w:rFonts w:cstheme="majorBidi"/>
+        </w:rPr>
+        <w:t>”</w:t>
+      </w:r>
+    </w:p>
+    <w:p>
+      <w:pPr>
+        <w:jc w:val="both"/>
+        <w:rPr>
+          <w:rFonts w:cstheme="majorBidi"/>
+        </w:rPr>
+      </w:pPr>
+      <w:r>
+        <w:rPr>
+          <w:rFonts w:cstheme="majorBidi"/>
+        </w:rPr>
+        <w:t>‘</w:t>
+      </w:r>
+      <w:r>
+        <w:rPr>
+          <w:rFonts w:cstheme="majorBidi"/>
+        </w:rPr>
+        <w:t>V_irri_m3</w:t>
+      </w:r>
+      <w:r>
+        <w:rPr>
+          <w:rFonts w:cstheme="majorBidi"/>
+        </w:rPr>
+        <w:t>’</w:t>
+      </w:r>
+      <w:r>
+        <w:rPr>
+          <w:rFonts w:cstheme="majorBidi"/>
+        </w:rPr>
+        <w:t xml:space="preserve"> = </w:t>
+      </w:r>
+      <w:proofErr w:type="spellStart"/>
+      <w:proofErr w:type="gramStart"/>
+      <w:r>
+        <w:rPr>
+          <w:rFonts w:cstheme="majorBidi"/>
+        </w:rPr>
+        <w:t>np.array</w:t>
+      </w:r>
+      <w:proofErr w:type="spellEnd"/>
+      <w:proofErr w:type="gramEnd"/>
+      <w:r>
+        <w:rPr>
+          <w:rFonts w:cstheme="majorBidi"/>
+        </w:rPr>
+        <w:t>([</w:t>
+      </w:r>
+      <w:r>
+        <w:rPr>
+          <w:rFonts w:cstheme="majorBidi"/>
+        </w:rPr>
+        <w:t>20</w:t>
+      </w:r>
+      <w:r>
+        <w:rPr>
+          <w:rFonts w:cstheme="majorBidi"/>
+        </w:rPr>
+        <w:t>, 10, 70, 40, 30])</w:t>
+      </w:r>
+    </w:p>
+    <w:p>
+      <w:pPr>
+        <w:jc w:val="both"/>
+        <w:rPr>
+          <w:rFonts w:cstheme="majorBidi"/>
+        </w:rPr>
+      </w:pPr>
+      <w:proofErr w:type="spellStart"/>
+      <w:r>
+        <w:rPr>
+          <w:rFonts w:cstheme="majorBidi"/>
+        </w:rPr>
+        <w:t>default_power</w:t>
+      </w:r>
+      <w:proofErr w:type="spellEnd"/>
+      <w:r>
+        <w:rPr>
+          <w:rFonts w:cstheme="majorBidi"/>
+        </w:rPr>
+        <w:t xml:space="preserve"> = "Electricity"</w:t>
+      </w:r>
+      <w:r>
+        <w:rPr>
+          <w:rFonts w:cstheme="majorBidi"/>
+        </w:rPr>
+        <w:t xml:space="preserve"> # changed due to AR U region only have electricity</w:t>
+      </w:r>
+    </w:p>
+    <w:p>
+      <w:pPr>
+        <w:jc w:val="both"/>
+        <w:rPr>
+          <w:rFonts w:cstheme="majorBidi"/>
+        </w:rPr>
+      </w:pPr>
+    </w:p>
+    <w:p>
+      <w:pPr>
+        <w:jc w:val="both"/>
+        <w:rPr>
+          <w:rFonts w:cstheme="majorBidi"/>
+        </w:rPr>
+      </w:pPr>
+      <w:r>
+        <w:rPr>
+          <w:rFonts w:cstheme="majorBidi"/>
+          <w:b/>
+          <w:bCs/>
+        </w:rPr>
+        <w:t>Table 2.</w:t>
+      </w:r>
+      <w:r>
+        <w:rPr>
+          <w:rFonts w:cstheme="majorBidi"/>
+        </w:rPr>
+        <w:t xml:space="preserve"> Output for Test 1 – emissions are 0 so function is working as expected.</w:t>
+      </w:r>
+    </w:p>
+    <w:p>
+      <w:pPr>
+        <w:jc w:val="both"/>
+        <w:rPr>
+          <w:rFonts w:cstheme="majorBidi"/>
+        </w:rPr>
+      </w:pPr>
+      <w:r>
+        <w:rPr>
+          <w:rFonts w:cstheme="majorBidi"/>
+        </w:rPr>
+        <w:drawing>
+          <wp:inline distT="0" distB="0" distL="0" distR="0" wp14:anchorId="5C71E2E9" wp14:editId="734882A8">
+            <wp:extent cx="5731510" cy="1054100"/>
+            <wp:effectExtent l="0" t="0" r="2540" b="0"/>
+            <wp:docPr id="2" name="Picture 2"/>
+            <wp:cNvGraphicFramePr>
+              <a:graphicFrameLocks xmlns:a="http://schemas.openxmlformats.org/drawingml/2006/main" noChangeAspect="1"/>
+            </wp:cNvGraphicFramePr>
+            <a:graphic xmlns:a="http://schemas.openxmlformats.org/drawingml/2006/main">
+              <a:graphicData uri="http://schemas.openxmlformats.org/drawingml/2006/picture">
+                <pic:pic xmlns:pic="http://schemas.openxmlformats.org/drawingml/2006/picture">
+                  <pic:nvPicPr>
+                    <pic:cNvPr id="1" name=""/>
+                    <pic:cNvPicPr/>
+                  </pic:nvPicPr>
+                  <pic:blipFill>
+                    <a:blip r:embed="rId6"/>
+                    <a:stretch>
+                      <a:fillRect/>
+                    </a:stretch>
+                  </pic:blipFill>
+                  <pic:spPr>
+                    <a:xfrm>
+                      <a:off x="0" y="0"/>
+                      <a:ext cx="5731510" cy="1054100"/>
+                    </a:xfrm>
+                    <a:prstGeom prst="rect">
+                      <a:avLst/>
+                    </a:prstGeom>
+                  </pic:spPr>
+                </pic:pic>
+              </a:graphicData>
+            </a:graphic>
+          </wp:inline>
+        </w:drawing>
+      </w:r>
+    </w:p>
+    <w:p>
+      <w:pPr>
+        <w:jc w:val="both"/>
+        <w:rPr>
+          <w:rFonts w:cstheme="majorBidi"/>
+        </w:rPr>
+      </w:pPr>
+    </w:p>
+    <w:p>
+      <w:pPr>
+        <w:jc w:val="both"/>
+        <w:rPr>
+          <w:rFonts w:cstheme="majorBidi"/>
+          <w:i/>
+          <w:iCs/>
+        </w:rPr>
+      </w:pPr>
+      <w:r>
+        <w:rPr>
+          <w:rFonts w:cstheme="majorBidi"/>
+          <w:i/>
+          <w:iCs/>
+        </w:rPr>
+        <w:t>Test 2</w:t>
+      </w:r>
+      <w:r>
+        <w:rPr>
+          <w:rFonts w:cstheme="majorBidi"/>
+          <w:i/>
+          <w:iCs/>
+        </w:rPr>
+        <w:t xml:space="preserve"> – testing 0 value for irrigation volume</w:t>
+      </w:r>
+    </w:p>
+    <w:p>
+      <w:pPr>
+        <w:jc w:val="both"/>
+        <w:rPr>
+          <w:rFonts w:cstheme="majorBidi"/>
+        </w:rPr>
+      </w:pPr>
+      <w:r>
+        <w:rPr>
+          <w:rFonts w:cstheme="majorBidi"/>
+        </w:rPr>
+        <w:t>‘</w:t>
+      </w:r>
+      <w:proofErr w:type="spellStart"/>
+      <w:r>
+        <w:rPr>
+          <w:rFonts w:cstheme="majorBidi"/>
+        </w:rPr>
+        <w:t>A_irri</w:t>
+      </w:r>
+      <w:proofErr w:type="spellEnd"/>
+      <w:r>
+        <w:rPr>
+          <w:rFonts w:cstheme="majorBidi"/>
+        </w:rPr>
+        <w:t xml:space="preserve">’ = </w:t>
+      </w:r>
+      <w:r>
+        <w:rPr>
+          <w:rFonts w:cstheme="majorBidi"/>
+        </w:rPr>
+        <w:t>1</w:t>
+      </w:r>
+      <w:r>
+        <w:rPr>
+          <w:rFonts w:cstheme="majorBidi"/>
+        </w:rPr>
+        <w:t xml:space="preserve"> # </w:t>
+      </w:r>
+      <w:r>
+        <w:rPr>
+          <w:rFonts w:cstheme="majorBidi"/>
+        </w:rPr>
+        <w:t>1</w:t>
+      </w:r>
+      <w:r>
+        <w:rPr>
+          <w:rFonts w:cstheme="majorBidi"/>
+        </w:rPr>
+        <w:t xml:space="preserve"> change in area</w:t>
+      </w:r>
+      <w:r>
+        <w:rPr>
+          <w:rFonts w:cstheme="majorBidi"/>
+        </w:rPr>
+        <w:t xml:space="preserve"> to see if increases occur where expected</w:t>
+      </w:r>
+    </w:p>
+    <w:p>
+      <w:pPr>
+        <w:jc w:val="both"/>
+        <w:rPr>
+          <w:rFonts w:cstheme="majorBidi"/>
+        </w:rPr>
+      </w:pPr>
+      <w:r>
+        <w:rPr>
+          <w:rFonts w:cstheme="majorBidi"/>
+        </w:rPr>
+        <w:t>‘A’ = 10</w:t>
+      </w:r>
+    </w:p>
+    <w:p>
+      <w:pPr>
+        <w:jc w:val="both"/>
+        <w:rPr>
+          <w:rFonts w:cstheme="majorBidi"/>
+        </w:rPr>
+      </w:pPr>
+      <w:r>
+        <w:rPr>
+          <w:rFonts w:cstheme="majorBidi"/>
+        </w:rPr>
+        <w:t>‘</w:t>
+      </w:r>
+      <w:proofErr w:type="spellStart"/>
+      <w:r>
+        <w:rPr>
+          <w:rFonts w:cstheme="majorBidi"/>
+        </w:rPr>
+        <w:t>Method_irri</w:t>
+      </w:r>
+      <w:proofErr w:type="spellEnd"/>
+      <w:r>
+        <w:rPr>
+          <w:rFonts w:cstheme="majorBidi"/>
+        </w:rPr>
+        <w:t>’ = “</w:t>
+      </w:r>
+      <w:r>
+        <w:rPr>
+          <w:rFonts w:cstheme="majorBidi"/>
+        </w:rPr>
+        <w:t>Surface</w:t>
+      </w:r>
+      <w:r>
+        <w:rPr>
+          <w:rFonts w:cstheme="majorBidi"/>
+        </w:rPr>
+        <w:t>” #</w:t>
+      </w:r>
+      <w:r>
+        <w:rPr>
+          <w:rFonts w:cstheme="majorBidi"/>
+        </w:rPr>
+        <w:t xml:space="preserve"> no change in method</w:t>
+      </w:r>
+    </w:p>
+    <w:p>
+      <w:pPr>
+        <w:jc w:val="both"/>
+        <w:rPr>
+          <w:rFonts w:cstheme="majorBidi"/>
+          <w:lang w:val="de-DE"/>
+        </w:rPr>
+      </w:pPr>
+      <w:r>
+        <w:rPr>
+          <w:rFonts w:cstheme="majorBidi"/>
+          <w:lang w:val="de-DE"/>
+        </w:rPr>
+        <w:t>‘Region_irri’ = “</w:t>
+      </w:r>
+      <w:r>
+        <w:rPr>
+          <w:rFonts w:cstheme="majorBidi"/>
+          <w:lang w:val="de-DE"/>
+        </w:rPr>
+        <w:t>GLO U</w:t>
+      </w:r>
+      <w:r>
+        <w:rPr>
+          <w:rFonts w:cstheme="majorBidi"/>
+          <w:lang w:val="de-DE"/>
+        </w:rPr>
+        <w:t xml:space="preserve">” # </w:t>
+      </w:r>
+      <w:r>
+        <w:rPr>
+          <w:rFonts w:cstheme="majorBidi"/>
+          <w:lang w:val="de-DE"/>
+        </w:rPr>
+        <w:t>no change</w:t>
+      </w:r>
+      <w:r>
+        <w:rPr>
+          <w:rFonts w:cstheme="majorBidi"/>
+          <w:lang w:val="de-DE"/>
+        </w:rPr>
+        <w:t xml:space="preserve"> in region</w:t>
+      </w:r>
+    </w:p>
+    <w:p>
+      <w:pPr>
+        <w:jc w:val="both"/>
+        <w:rPr>
+          <w:rFonts w:cstheme="majorBidi"/>
+        </w:rPr>
+      </w:pPr>
+      <w:r>
+        <w:rPr>
+          <w:rFonts w:cstheme="majorBidi"/>
+        </w:rPr>
+        <w:t>‘</w:t>
+      </w:r>
+      <w:proofErr w:type="spellStart"/>
+      <w:proofErr w:type="gramStart"/>
+      <w:r>
+        <w:rPr>
+          <w:rFonts w:cstheme="majorBidi"/>
+        </w:rPr>
+        <w:t>irrigation</w:t>
+      </w:r>
+      <w:proofErr w:type="gramEnd"/>
+      <w:r>
+        <w:rPr>
+          <w:rFonts w:cstheme="majorBidi"/>
+        </w:rPr>
+        <w:t>_meas_unit</w:t>
+      </w:r>
+      <w:proofErr w:type="spellEnd"/>
+      <w:r>
+        <w:rPr>
+          <w:rFonts w:cstheme="majorBidi"/>
+        </w:rPr>
+        <w:t>’ = “m3”</w:t>
+      </w:r>
+    </w:p>
+    <w:p>
+      <w:pPr>
+        <w:jc w:val="both"/>
+        <w:rPr>
+          <w:rFonts w:cstheme="majorBidi"/>
+        </w:rPr>
+      </w:pPr>
+      <w:r>
+        <w:rPr>
+          <w:rFonts w:cstheme="majorBidi"/>
+        </w:rPr>
+        <w:t xml:space="preserve">V_irri_m3 = </w:t>
+      </w:r>
+      <w:proofErr w:type="spellStart"/>
+      <w:proofErr w:type="gramStart"/>
+      <w:r>
+        <w:rPr>
+          <w:rFonts w:cstheme="majorBidi"/>
+        </w:rPr>
+        <w:t>np.array</w:t>
+      </w:r>
+      <w:proofErr w:type="spellEnd"/>
+      <w:proofErr w:type="gramEnd"/>
+      <w:r>
+        <w:rPr>
+          <w:rFonts w:cstheme="majorBidi"/>
+        </w:rPr>
+        <w:t>([0, 10, 70, 40, 30])</w:t>
+      </w:r>
+      <w:r>
+        <w:rPr>
+          <w:rFonts w:cstheme="majorBidi"/>
+        </w:rPr>
+        <w:t xml:space="preserve"> # irr</w:t>
+      </w:r>
+      <w:r>
+        <w:rPr>
+          <w:rFonts w:cstheme="majorBidi"/>
+        </w:rPr>
+        <w:t>igation is 0 for only one field</w:t>
+      </w:r>
+    </w:p>
+    <w:p>
+      <w:pPr>
+        <w:jc w:val="both"/>
+        <w:rPr>
+          <w:rFonts w:cstheme="majorBidi"/>
+        </w:rPr>
+      </w:pPr>
+      <w:proofErr w:type="spellStart"/>
+      <w:r>
+        <w:rPr>
+          <w:rFonts w:cstheme="majorBidi"/>
+        </w:rPr>
+        <w:t>Power_irri</w:t>
+      </w:r>
+      <w:proofErr w:type="spellEnd"/>
+      <w:r>
+        <w:rPr>
+          <w:rFonts w:cstheme="majorBidi"/>
+        </w:rPr>
+        <w:t xml:space="preserve"> = ["Electricity", "Electricity", "Diesel", "Electricity", "Diesel"]</w:t>
+      </w:r>
+    </w:p>
+    <w:p>
+      <w:pPr>
+        <w:jc w:val="both"/>
+        <w:rPr>
+          <w:rFonts w:cstheme="majorBidi"/>
+        </w:rPr>
+      </w:pPr>
+    </w:p>
+    <w:p>
+      <w:pPr>
+        <w:jc w:val="both"/>
+        <w:rPr>
+          <w:rFonts w:cstheme="majorBidi"/>
+        </w:rPr>
+      </w:pPr>
+      <w:r>
+        <w:rPr>
+          <w:rFonts w:cstheme="majorBidi"/>
+          <w:b/>
+          <w:bCs/>
+        </w:rPr>
+        <w:t>Table 3.</w:t>
+      </w:r>
+      <w:r>
+        <w:rPr>
+          <w:rFonts w:cstheme="majorBidi"/>
+        </w:rPr>
+        <w:t xml:space="preserve"> Output for Test 2 – emissions are 0 for the field with 0 irrigation applied, which is as we would expect.</w:t>
+      </w:r>
+    </w:p>
+    <w:p>
+      <w:pPr>
+        <w:jc w:val="both"/>
+        <w:rPr>
+          <w:rFonts w:cstheme="majorBidi"/>
+        </w:rPr>
+      </w:pPr>
+      <w:r>
+        <w:rPr>
+          <w:rFonts w:cstheme="majorBidi"/>
+        </w:rPr>
+        <w:lastRenderedPageBreak/>
+        <w:drawing>
+          <wp:inline distT="0" distB="0" distL="0" distR="0" wp14:anchorId="20882CBB" wp14:editId="5E1D834C">
+            <wp:extent cx="5731510" cy="1038225"/>
+            <wp:effectExtent l="0" t="0" r="2540" b="9525"/>
+            <wp:docPr id="3" name="Picture 3"/>
+            <wp:cNvGraphicFramePr>
+              <a:graphicFrameLocks xmlns:a="http://schemas.openxmlformats.org/drawingml/2006/main" noChangeAspect="1"/>
+            </wp:cNvGraphicFramePr>
+            <a:graphic xmlns:a="http://schemas.openxmlformats.org/drawingml/2006/main">
+              <a:graphicData uri="http://schemas.openxmlformats.org/drawingml/2006/picture">
+                <pic:pic xmlns:pic="http://schemas.openxmlformats.org/drawingml/2006/picture">
+                  <pic:nvPicPr>
+                    <pic:cNvPr id="1" name=""/>
+                    <pic:cNvPicPr/>
+                  </pic:nvPicPr>
+                  <pic:blipFill>
+                    <a:blip r:embed="rId7"/>
+                    <a:stretch>
+                      <a:fillRect/>
+                    </a:stretch>
+                  </pic:blipFill>
+                  <pic:spPr>
+                    <a:xfrm>
+                      <a:off x="0" y="0"/>
+                      <a:ext cx="5731510" cy="1038225"/>
+                    </a:xfrm>
+                    <a:prstGeom prst="rect">
+                      <a:avLst/>
+                    </a:prstGeom>
+                  </pic:spPr>
+                </pic:pic>
+              </a:graphicData>
+            </a:graphic>
+          </wp:inline>
+        </w:drawing>
+      </w:r>
+    </w:p>
+    <w:p>
+      <w:pPr>
+        <w:jc w:val="both"/>
+        <w:rPr>
+          <w:rFonts w:cstheme="majorBidi"/>
+        </w:rPr>
+      </w:pPr>
+    </w:p>
+    <w:p>
+      <w:pPr>
+        <w:jc w:val="both"/>
+        <w:rPr>
+          <w:rFonts w:cstheme="majorBidi"/>
+        </w:rPr>
+      </w:pPr>
+    </w:p>
+    <w:p>
+      <w:pPr>
+        <w:jc w:val="both"/>
+        <w:rPr>
+          <w:rFonts w:cstheme="majorBidi"/>
+          <w:i/>
+          <w:iCs/>
+        </w:rPr>
+      </w:pPr>
+      <w:r>
+        <w:rPr>
+          <w:rFonts w:cstheme="majorBidi"/>
+          <w:i/>
+          <w:iCs/>
+        </w:rPr>
+        <w:t xml:space="preserve">Test </w:t>
+      </w:r>
+      <w:r>
+        <w:rPr>
+          <w:rFonts w:cstheme="majorBidi"/>
+          <w:i/>
+          <w:iCs/>
+        </w:rPr>
+        <w:t>3</w:t>
+      </w:r>
+      <w:r>
+        <w:rPr>
+          <w:rFonts w:cstheme="majorBidi"/>
+          <w:i/>
+          <w:iCs/>
+        </w:rPr>
+        <w:t xml:space="preserve"> – testing conversion method</w:t>
+      </w:r>
+    </w:p>
+    <w:p>
+      <w:pPr>
+        <w:jc w:val="both"/>
+        <w:rPr>
+          <w:rFonts w:cstheme="majorBidi"/>
+        </w:rPr>
+      </w:pPr>
+      <w:r>
+        <w:rPr>
+          <w:rFonts w:cstheme="majorBidi"/>
+        </w:rPr>
+        <w:t>‘</w:t>
+      </w:r>
+      <w:proofErr w:type="spellStart"/>
+      <w:r>
+        <w:rPr>
+          <w:rFonts w:cstheme="majorBidi"/>
+        </w:rPr>
+        <w:t>A_irri</w:t>
+      </w:r>
+      <w:proofErr w:type="spellEnd"/>
+      <w:r>
+        <w:rPr>
+          <w:rFonts w:cstheme="majorBidi"/>
+        </w:rPr>
+        <w:t>’ = 0.5 # no change in area</w:t>
+      </w:r>
+    </w:p>
+    <w:p>
+      <w:pPr>
+        <w:jc w:val="both"/>
+        <w:rPr>
+          <w:rFonts w:cstheme="majorBidi"/>
+        </w:rPr>
+      </w:pPr>
+      <w:r>
+        <w:rPr>
+          <w:rFonts w:cstheme="majorBidi"/>
+        </w:rPr>
+        <w:t>‘A’ = 10</w:t>
+      </w:r>
+    </w:p>
+    <w:p>
+      <w:pPr>
+        <w:jc w:val="both"/>
+        <w:rPr>
+          <w:rFonts w:cstheme="majorBidi"/>
+        </w:rPr>
+      </w:pPr>
+      <w:r>
+        <w:rPr>
+          <w:rFonts w:cstheme="majorBidi"/>
+        </w:rPr>
+        <w:t>‘</w:t>
+      </w:r>
+      <w:proofErr w:type="spellStart"/>
+      <w:r>
+        <w:rPr>
+          <w:rFonts w:cstheme="majorBidi"/>
+        </w:rPr>
+        <w:t>Method_irri</w:t>
+      </w:r>
+      <w:proofErr w:type="spellEnd"/>
+      <w:r>
+        <w:rPr>
+          <w:rFonts w:cstheme="majorBidi"/>
+        </w:rPr>
+        <w:t>’ = “Surface” # no change in method</w:t>
+      </w:r>
+    </w:p>
+    <w:p>
+      <w:pPr>
+        <w:jc w:val="both"/>
+        <w:rPr>
+          <w:rFonts w:cstheme="majorBidi"/>
+        </w:rPr>
+      </w:pPr>
+      <w:r>
+        <w:rPr>
+          <w:rFonts w:cstheme="majorBidi"/>
+        </w:rPr>
+        <w:t>‘</w:t>
+      </w:r>
+      <w:proofErr w:type="spellStart"/>
+      <w:r>
+        <w:rPr>
+          <w:rFonts w:cstheme="majorBidi"/>
+        </w:rPr>
+        <w:t>Region_irri</w:t>
+      </w:r>
+      <w:proofErr w:type="spellEnd"/>
+      <w:r>
+        <w:rPr>
+          <w:rFonts w:cstheme="majorBidi"/>
+        </w:rPr>
+        <w:t>’ = “GLO U” # no change in region</w:t>
+      </w:r>
+    </w:p>
+    <w:p>
+      <w:pPr>
+        <w:jc w:val="both"/>
+        <w:rPr>
+          <w:rFonts w:cstheme="majorBidi"/>
+        </w:rPr>
+      </w:pPr>
+      <w:r>
+        <w:rPr>
+          <w:rFonts w:cstheme="majorBidi"/>
+        </w:rPr>
+        <w:t>‘</w:t>
+      </w:r>
+      <w:proofErr w:type="spellStart"/>
+      <w:proofErr w:type="gramStart"/>
+      <w:r>
+        <w:rPr>
+          <w:rFonts w:cstheme="majorBidi"/>
+        </w:rPr>
+        <w:t>irrigation</w:t>
+      </w:r>
+      <w:proofErr w:type="gramEnd"/>
+      <w:r>
+        <w:rPr>
+          <w:rFonts w:cstheme="majorBidi"/>
+        </w:rPr>
+        <w:t>_meas_unit</w:t>
+      </w:r>
+      <w:proofErr w:type="spellEnd"/>
+      <w:r>
+        <w:rPr>
+          <w:rFonts w:cstheme="majorBidi"/>
+        </w:rPr>
+        <w:t>’ = “m</w:t>
+      </w:r>
+      <w:r>
+        <w:rPr>
+          <w:rFonts w:cstheme="majorBidi"/>
+        </w:rPr>
+        <w:t>m</w:t>
+      </w:r>
+      <w:r>
+        <w:rPr>
+          <w:rFonts w:cstheme="majorBidi"/>
+        </w:rPr>
+        <w:t>”</w:t>
+      </w:r>
+      <w:r>
+        <w:rPr>
+          <w:rFonts w:cstheme="majorBidi"/>
+        </w:rPr>
+        <w:t xml:space="preserve"> # conversion factor should be applied</w:t>
+      </w:r>
+    </w:p>
+    <w:p>
+      <w:pPr>
+        <w:jc w:val="both"/>
+        <w:rPr>
+          <w:rFonts w:cstheme="majorBidi"/>
+        </w:rPr>
+      </w:pPr>
+      <w:proofErr w:type="spellStart"/>
+      <w:r>
+        <w:rPr>
+          <w:rFonts w:cstheme="majorBidi"/>
+        </w:rPr>
+        <w:t>D</w:t>
+      </w:r>
+      <w:r>
+        <w:rPr>
+          <w:rFonts w:cstheme="majorBidi"/>
+        </w:rPr>
+        <w:t>_irri_m</w:t>
+      </w:r>
+      <w:r>
+        <w:rPr>
+          <w:rFonts w:cstheme="majorBidi"/>
+        </w:rPr>
+        <w:t>m</w:t>
+      </w:r>
+      <w:proofErr w:type="spellEnd"/>
+      <w:r>
+        <w:rPr>
+          <w:rFonts w:cstheme="majorBidi"/>
+        </w:rPr>
+        <w:t xml:space="preserve"> = </w:t>
+      </w:r>
+      <w:proofErr w:type="spellStart"/>
+      <w:proofErr w:type="gramStart"/>
+      <w:r>
+        <w:rPr>
+          <w:rFonts w:cstheme="majorBidi"/>
+        </w:rPr>
+        <w:t>np.array</w:t>
+      </w:r>
+      <w:proofErr w:type="spellEnd"/>
+      <w:proofErr w:type="gramEnd"/>
+      <w:r>
+        <w:rPr>
+          <w:rFonts w:ascii="Consolas" w:eastAsia="Times New Roman" w:hAnsi="Consolas" w:cs="Times New Roman"/>
+          <w:color w:val="3B3B3B"/>
+          <w:kern w:val="0"/>
+          <w:sz w:val="21"/>
+          <w:szCs w:val="21"/>
+          <w14:ligatures w14:val="none"/>
+        </w:rPr>
+        <w:t xml:space="preserve"> </w:t>
+      </w:r>
+      <w:r>
+        <w:rPr>
+          <w:rFonts w:cstheme="majorBidi"/>
+        </w:rPr>
+        <w:t>([</w:t>
+      </w:r>
+      <w:r>
+        <w:rPr>
+          <w:rFonts w:cstheme="majorBidi"/>
+        </w:rPr>
+        <w:t>0</w:t>
+      </w:r>
+      <w:r>
+        <w:rPr>
+          <w:rFonts w:cstheme="majorBidi"/>
+        </w:rPr>
+        <w:t>, 1, 7, 4, 3])</w:t>
+      </w:r>
+      <w:r>
+        <w:rPr>
+          <w:rFonts w:cstheme="majorBidi"/>
+        </w:rPr>
+        <w:t xml:space="preserve"> #dep</w:t>
+      </w:r>
+      <w:r>
+        <w:rPr>
+          <w:rFonts w:cstheme="majorBidi"/>
+        </w:rPr>
+        <w:t>th irrigation should be used and only one field should say 0.</w:t>
+      </w:r>
+    </w:p>
+    <w:p>
+      <w:pPr>
+        <w:jc w:val="both"/>
+        <w:rPr>
+          <w:rFonts w:cstheme="majorBidi"/>
+        </w:rPr>
+      </w:pPr>
+      <w:proofErr w:type="spellStart"/>
+      <w:r>
+        <w:rPr>
+          <w:rFonts w:cstheme="majorBidi"/>
+        </w:rPr>
+        <w:t>Power_irri</w:t>
+      </w:r>
+      <w:proofErr w:type="spellEnd"/>
+      <w:r>
+        <w:rPr>
+          <w:rFonts w:cstheme="majorBidi"/>
+        </w:rPr>
+        <w:t xml:space="preserve"> = ["Electricity", "Electricity", "Diesel", "Electricity", "Diesel"]</w:t>
+      </w:r>
+    </w:p>
+    <w:p>
+      <w:pPr>
+        <w:jc w:val="both"/>
+        <w:rPr>
+          <w:rFonts w:cstheme="majorBidi"/>
+        </w:rPr>
+      </w:pPr>
+    </w:p>
+    <w:p>
+      <w:pPr>
+        <w:jc w:val="both"/>
+        <w:rPr>
+          <w:rFonts w:cstheme="majorBidi"/>
+        </w:rPr>
+      </w:pPr>
+      <w:r>
+        <w:rPr>
+          <w:rFonts w:cstheme="majorBidi"/>
+          <w:b/>
+          <w:bCs/>
+        </w:rPr>
+        <w:t>Table 4.</w:t>
+      </w:r>
+      <w:r>
+        <w:rPr>
+          <w:rFonts w:cstheme="majorBidi"/>
+        </w:rPr>
+        <w:t xml:space="preserve"> Outputs from Test 3 show that the conversion from mm to m3 works as we get the same output as Table 1 except for the field which had 0 irrigation applied, which was calculated to have 0 emissions. This is what we expect from the conversion method so this is good.</w:t>
+      </w:r>
+    </w:p>
+    <w:p>
+      <w:pPr>
+        <w:jc w:val="both"/>
+        <w:rPr>
+          <w:rFonts w:cstheme="majorBidi"/>
+        </w:rPr>
+      </w:pPr>
+      <w:r>
+        <w:rPr>
+          <w:rFonts w:cstheme="majorBidi"/>
+        </w:rPr>
+        <w:drawing>
+          <wp:inline distT="0" distB="0" distL="0" distR="0" wp14:anchorId="1F77EF3C" wp14:editId="48085474">
+            <wp:extent cx="5731510" cy="1043305"/>
+            <wp:effectExtent l="0" t="0" r="2540" b="4445"/>
+            <wp:docPr id="4" name="Picture 4"/>
+            <wp:cNvGraphicFramePr>
+              <a:graphicFrameLocks xmlns:a="http://schemas.openxmlformats.org/drawingml/2006/main" noChangeAspect="1"/>
+            </wp:cNvGraphicFramePr>
+            <a:graphic xmlns:a="http://schemas.openxmlformats.org/drawingml/2006/main">
+              <a:graphicData uri="http://schemas.openxmlformats.org/drawingml/2006/picture">
+                <pic:pic xmlns:pic="http://schemas.openxmlformats.org/drawingml/2006/picture">
+                  <pic:nvPicPr>
+                    <pic:cNvPr id="1" name=""/>
+                    <pic:cNvPicPr/>
+                  </pic:nvPicPr>
+                  <pic:blipFill>
+                    <a:blip r:embed="rId8"/>
+                    <a:stretch>
+                      <a:fillRect/>
+                    </a:stretch>
+                  </pic:blipFill>
+                  <pic:spPr>
+                    <a:xfrm>
+                      <a:off x="0" y="0"/>
+                      <a:ext cx="5731510" cy="1043305"/>
+                    </a:xfrm>
+                    <a:prstGeom prst="rect">
+                      <a:avLst/>
+                    </a:prstGeom>
+                  </pic:spPr>
+                </pic:pic>
+              </a:graphicData>
+            </a:graphic>
+          </wp:inline>
+        </w:drawing>
       </w:r>
     </w:p>
     <w:sectPr>
@@ -1465,8 +3530,356 @@
       </w:rPr>
     </w:lvl>
   </w:abstractNum>
+  <w:abstractNum w:abstractNumId="1" w15:restartNumberingAfterBreak="0">
+    <w:nsid w:val="646F4CD2"/>
+    <w:multiLevelType w:val="hybridMultilevel"/>
+    <w:tmpl w:val="712AFC0A"/>
+    <w:lvl w:ilvl="0" w:tplc="08090001">
+      <w:start w:val="1"/>
+      <w:numFmt w:val="bullet"/>
+      <w:lvlText w:val=""/>
+      <w:lvlJc w:val="left"/>
+      <w:pPr>
+        <w:ind w:left="720" w:hanging="360"/>
+      </w:pPr>
+      <w:rPr>
+        <w:rFonts w:ascii="Symbol" w:hAnsi="Symbol" w:hint="default"/>
+      </w:rPr>
+    </w:lvl>
+    <w:lvl w:ilvl="1" w:tplc="08090003" w:tentative="1">
+      <w:start w:val="1"/>
+      <w:numFmt w:val="bullet"/>
+      <w:lvlText w:val="o"/>
+      <w:lvlJc w:val="left"/>
+      <w:pPr>
+        <w:ind w:left="1440" w:hanging="360"/>
+      </w:pPr>
+      <w:rPr>
+        <w:rFonts w:ascii="Courier New" w:hAnsi="Courier New" w:cs="Courier New" w:hint="default"/>
+      </w:rPr>
+    </w:lvl>
+    <w:lvl w:ilvl="2" w:tplc="08090005" w:tentative="1">
+      <w:start w:val="1"/>
+      <w:numFmt w:val="bullet"/>
+      <w:lvlText w:val=""/>
+      <w:lvlJc w:val="left"/>
+      <w:pPr>
+        <w:ind w:left="2160" w:hanging="360"/>
+      </w:pPr>
+      <w:rPr>
+        <w:rFonts w:ascii="Wingdings" w:hAnsi="Wingdings" w:hint="default"/>
+      </w:rPr>
+    </w:lvl>
+    <w:lvl w:ilvl="3" w:tplc="08090001" w:tentative="1">
+      <w:start w:val="1"/>
+      <w:numFmt w:val="bullet"/>
+      <w:lvlText w:val=""/>
+      <w:lvlJc w:val="left"/>
+      <w:pPr>
+        <w:ind w:left="2880" w:hanging="360"/>
+      </w:pPr>
+      <w:rPr>
+        <w:rFonts w:ascii="Symbol" w:hAnsi="Symbol" w:hint="default"/>
+      </w:rPr>
+    </w:lvl>
+    <w:lvl w:ilvl="4" w:tplc="08090003" w:tentative="1">
+      <w:start w:val="1"/>
+      <w:numFmt w:val="bullet"/>
+      <w:lvlText w:val="o"/>
+      <w:lvlJc w:val="left"/>
+      <w:pPr>
+        <w:ind w:left="3600" w:hanging="360"/>
+      </w:pPr>
+      <w:rPr>
+        <w:rFonts w:ascii="Courier New" w:hAnsi="Courier New" w:cs="Courier New" w:hint="default"/>
+      </w:rPr>
+    </w:lvl>
+    <w:lvl w:ilvl="5" w:tplc="08090005" w:tentative="1">
+      <w:start w:val="1"/>
+      <w:numFmt w:val="bullet"/>
+      <w:lvlText w:val=""/>
+      <w:lvlJc w:val="left"/>
+      <w:pPr>
+        <w:ind w:left="4320" w:hanging="360"/>
+      </w:pPr>
+      <w:rPr>
+        <w:rFonts w:ascii="Wingdings" w:hAnsi="Wingdings" w:hint="default"/>
+      </w:rPr>
+    </w:lvl>
+    <w:lvl w:ilvl="6" w:tplc="08090001" w:tentative="1">
+      <w:start w:val="1"/>
+      <w:numFmt w:val="bullet"/>
+      <w:lvlText w:val=""/>
+      <w:lvlJc w:val="left"/>
+      <w:pPr>
+        <w:ind w:left="5040" w:hanging="360"/>
+      </w:pPr>
+      <w:rPr>
+        <w:rFonts w:ascii="Symbol" w:hAnsi="Symbol" w:hint="default"/>
+      </w:rPr>
+    </w:lvl>
+    <w:lvl w:ilvl="7" w:tplc="08090003" w:tentative="1">
+      <w:start w:val="1"/>
+      <w:numFmt w:val="bullet"/>
+      <w:lvlText w:val="o"/>
+      <w:lvlJc w:val="left"/>
+      <w:pPr>
+        <w:ind w:left="5760" w:hanging="360"/>
+      </w:pPr>
+      <w:rPr>
+        <w:rFonts w:ascii="Courier New" w:hAnsi="Courier New" w:cs="Courier New" w:hint="default"/>
+      </w:rPr>
+    </w:lvl>
+    <w:lvl w:ilvl="8" w:tplc="08090005" w:tentative="1">
+      <w:start w:val="1"/>
+      <w:numFmt w:val="bullet"/>
+      <w:lvlText w:val=""/>
+      <w:lvlJc w:val="left"/>
+      <w:pPr>
+        <w:ind w:left="6480" w:hanging="360"/>
+      </w:pPr>
+      <w:rPr>
+        <w:rFonts w:ascii="Wingdings" w:hAnsi="Wingdings" w:hint="default"/>
+      </w:rPr>
+    </w:lvl>
+  </w:abstractNum>
+  <w:abstractNum w:abstractNumId="2" w15:restartNumberingAfterBreak="0">
+    <w:nsid w:val="6B016699"/>
+    <w:multiLevelType w:val="hybridMultilevel"/>
+    <w:tmpl w:val="A5A2B6A4"/>
+    <w:lvl w:ilvl="0" w:tplc="08090001">
+      <w:start w:val="1"/>
+      <w:numFmt w:val="bullet"/>
+      <w:lvlText w:val=""/>
+      <w:lvlJc w:val="left"/>
+      <w:pPr>
+        <w:ind w:left="720" w:hanging="360"/>
+      </w:pPr>
+      <w:rPr>
+        <w:rFonts w:ascii="Symbol" w:hAnsi="Symbol" w:hint="default"/>
+      </w:rPr>
+    </w:lvl>
+    <w:lvl w:ilvl="1" w:tplc="08090003" w:tentative="1">
+      <w:start w:val="1"/>
+      <w:numFmt w:val="bullet"/>
+      <w:lvlText w:val="o"/>
+      <w:lvlJc w:val="left"/>
+      <w:pPr>
+        <w:ind w:left="1440" w:hanging="360"/>
+      </w:pPr>
+      <w:rPr>
+        <w:rFonts w:ascii="Courier New" w:hAnsi="Courier New" w:cs="Courier New" w:hint="default"/>
+      </w:rPr>
+    </w:lvl>
+    <w:lvl w:ilvl="2" w:tplc="08090005" w:tentative="1">
+      <w:start w:val="1"/>
+      <w:numFmt w:val="bullet"/>
+      <w:lvlText w:val=""/>
+      <w:lvlJc w:val="left"/>
+      <w:pPr>
+        <w:ind w:left="2160" w:hanging="360"/>
+      </w:pPr>
+      <w:rPr>
+        <w:rFonts w:ascii="Wingdings" w:hAnsi="Wingdings" w:hint="default"/>
+      </w:rPr>
+    </w:lvl>
+    <w:lvl w:ilvl="3" w:tplc="08090001" w:tentative="1">
+      <w:start w:val="1"/>
+      <w:numFmt w:val="bullet"/>
+      <w:lvlText w:val=""/>
+      <w:lvlJc w:val="left"/>
+      <w:pPr>
+        <w:ind w:left="2880" w:hanging="360"/>
+      </w:pPr>
+      <w:rPr>
+        <w:rFonts w:ascii="Symbol" w:hAnsi="Symbol" w:hint="default"/>
+      </w:rPr>
+    </w:lvl>
+    <w:lvl w:ilvl="4" w:tplc="08090003" w:tentative="1">
+      <w:start w:val="1"/>
+      <w:numFmt w:val="bullet"/>
+      <w:lvlText w:val="o"/>
+      <w:lvlJc w:val="left"/>
+      <w:pPr>
+        <w:ind w:left="3600" w:hanging="360"/>
+      </w:pPr>
+      <w:rPr>
+        <w:rFonts w:ascii="Courier New" w:hAnsi="Courier New" w:cs="Courier New" w:hint="default"/>
+      </w:rPr>
+    </w:lvl>
+    <w:lvl w:ilvl="5" w:tplc="08090005" w:tentative="1">
+      <w:start w:val="1"/>
+      <w:numFmt w:val="bullet"/>
+      <w:lvlText w:val=""/>
+      <w:lvlJc w:val="left"/>
+      <w:pPr>
+        <w:ind w:left="4320" w:hanging="360"/>
+      </w:pPr>
+      <w:rPr>
+        <w:rFonts w:ascii="Wingdings" w:hAnsi="Wingdings" w:hint="default"/>
+      </w:rPr>
+    </w:lvl>
+    <w:lvl w:ilvl="6" w:tplc="08090001" w:tentative="1">
+      <w:start w:val="1"/>
+      <w:numFmt w:val="bullet"/>
+      <w:lvlText w:val=""/>
+      <w:lvlJc w:val="left"/>
+      <w:pPr>
+        <w:ind w:left="5040" w:hanging="360"/>
+      </w:pPr>
+      <w:rPr>
+        <w:rFonts w:ascii="Symbol" w:hAnsi="Symbol" w:hint="default"/>
+      </w:rPr>
+    </w:lvl>
+    <w:lvl w:ilvl="7" w:tplc="08090003" w:tentative="1">
+      <w:start w:val="1"/>
+      <w:numFmt w:val="bullet"/>
+      <w:lvlText w:val="o"/>
+      <w:lvlJc w:val="left"/>
+      <w:pPr>
+        <w:ind w:left="5760" w:hanging="360"/>
+      </w:pPr>
+      <w:rPr>
+        <w:rFonts w:ascii="Courier New" w:hAnsi="Courier New" w:cs="Courier New" w:hint="default"/>
+      </w:rPr>
+    </w:lvl>
+    <w:lvl w:ilvl="8" w:tplc="08090005" w:tentative="1">
+      <w:start w:val="1"/>
+      <w:numFmt w:val="bullet"/>
+      <w:lvlText w:val=""/>
+      <w:lvlJc w:val="left"/>
+      <w:pPr>
+        <w:ind w:left="6480" w:hanging="360"/>
+      </w:pPr>
+      <w:rPr>
+        <w:rFonts w:ascii="Wingdings" w:hAnsi="Wingdings" w:hint="default"/>
+      </w:rPr>
+    </w:lvl>
+  </w:abstractNum>
+  <w:abstractNum w:abstractNumId="3" w15:restartNumberingAfterBreak="0">
+    <w:nsid w:val="708F6BE5"/>
+    <w:multiLevelType w:val="hybridMultilevel"/>
+    <w:tmpl w:val="D82EE0D4"/>
+    <w:lvl w:ilvl="0" w:tplc="08090001">
+      <w:start w:val="1"/>
+      <w:numFmt w:val="bullet"/>
+      <w:lvlText w:val=""/>
+      <w:lvlJc w:val="left"/>
+      <w:pPr>
+        <w:ind w:left="720" w:hanging="360"/>
+      </w:pPr>
+      <w:rPr>
+        <w:rFonts w:ascii="Symbol" w:hAnsi="Symbol" w:hint="default"/>
+      </w:rPr>
+    </w:lvl>
+    <w:lvl w:ilvl="1" w:tplc="08090003" w:tentative="1">
+      <w:start w:val="1"/>
+      <w:numFmt w:val="bullet"/>
+      <w:lvlText w:val="o"/>
+      <w:lvlJc w:val="left"/>
+      <w:pPr>
+        <w:ind w:left="1440" w:hanging="360"/>
+      </w:pPr>
+      <w:rPr>
+        <w:rFonts w:ascii="Courier New" w:hAnsi="Courier New" w:cs="Courier New" w:hint="default"/>
+      </w:rPr>
+    </w:lvl>
+    <w:lvl w:ilvl="2" w:tplc="08090005" w:tentative="1">
+      <w:start w:val="1"/>
+      <w:numFmt w:val="bullet"/>
+      <w:lvlText w:val=""/>
+      <w:lvlJc w:val="left"/>
+      <w:pPr>
+        <w:ind w:left="2160" w:hanging="360"/>
+      </w:pPr>
+      <w:rPr>
+        <w:rFonts w:ascii="Wingdings" w:hAnsi="Wingdings" w:hint="default"/>
+      </w:rPr>
+    </w:lvl>
+    <w:lvl w:ilvl="3" w:tplc="08090001" w:tentative="1">
+      <w:start w:val="1"/>
+      <w:numFmt w:val="bullet"/>
+      <w:lvlText w:val=""/>
+      <w:lvlJc w:val="left"/>
+      <w:pPr>
+        <w:ind w:left="2880" w:hanging="360"/>
+      </w:pPr>
+      <w:rPr>
+        <w:rFonts w:ascii="Symbol" w:hAnsi="Symbol" w:hint="default"/>
+      </w:rPr>
+    </w:lvl>
+    <w:lvl w:ilvl="4" w:tplc="08090003" w:tentative="1">
+      <w:start w:val="1"/>
+      <w:numFmt w:val="bullet"/>
+      <w:lvlText w:val="o"/>
+      <w:lvlJc w:val="left"/>
+      <w:pPr>
+        <w:ind w:left="3600" w:hanging="360"/>
+      </w:pPr>
+      <w:rPr>
+        <w:rFonts w:ascii="Courier New" w:hAnsi="Courier New" w:cs="Courier New" w:hint="default"/>
+      </w:rPr>
+    </w:lvl>
+    <w:lvl w:ilvl="5" w:tplc="08090005" w:tentative="1">
+      <w:start w:val="1"/>
+      <w:numFmt w:val="bullet"/>
+      <w:lvlText w:val=""/>
+      <w:lvlJc w:val="left"/>
+      <w:pPr>
+        <w:ind w:left="4320" w:hanging="360"/>
+      </w:pPr>
+      <w:rPr>
+        <w:rFonts w:ascii="Wingdings" w:hAnsi="Wingdings" w:hint="default"/>
+      </w:rPr>
+    </w:lvl>
+    <w:lvl w:ilvl="6" w:tplc="08090001" w:tentative="1">
+      <w:start w:val="1"/>
+      <w:numFmt w:val="bullet"/>
+      <w:lvlText w:val=""/>
+      <w:lvlJc w:val="left"/>
+      <w:pPr>
+        <w:ind w:left="5040" w:hanging="360"/>
+      </w:pPr>
+      <w:rPr>
+        <w:rFonts w:ascii="Symbol" w:hAnsi="Symbol" w:hint="default"/>
+      </w:rPr>
+    </w:lvl>
+    <w:lvl w:ilvl="7" w:tplc="08090003" w:tentative="1">
+      <w:start w:val="1"/>
+      <w:numFmt w:val="bullet"/>
+      <w:lvlText w:val="o"/>
+      <w:lvlJc w:val="left"/>
+      <w:pPr>
+        <w:ind w:left="5760" w:hanging="360"/>
+      </w:pPr>
+      <w:rPr>
+        <w:rFonts w:ascii="Courier New" w:hAnsi="Courier New" w:cs="Courier New" w:hint="default"/>
+      </w:rPr>
+    </w:lvl>
+    <w:lvl w:ilvl="8" w:tplc="08090005" w:tentative="1">
+      <w:start w:val="1"/>
+      <w:numFmt w:val="bullet"/>
+      <w:lvlText w:val=""/>
+      <w:lvlJc w:val="left"/>
+      <w:pPr>
+        <w:ind w:left="6480" w:hanging="360"/>
+      </w:pPr>
+      <w:rPr>
+        <w:rFonts w:ascii="Wingdings" w:hAnsi="Wingdings" w:hint="default"/>
+      </w:rPr>
+    </w:lvl>
+  </w:abstractNum>
   <w:num w:numId="1">
     <w:abstractNumId w:val="0"/>
+  </w:num>
+  <w:num w:numId="2">
+    <w:abstractNumId w:val="1"/>
+  </w:num>
+  <w:num w:numId="3">
+    <w:abstractNumId w:val="3"/>
+  </w:num>
+  <w:num w:numId="4">
+    <w:abstractNumId w:val="2"/>
   </w:num>
 </w:numbering>
 </file>
@@ -1880,7 +4293,6 @@
   <w:style w:type="character" w:default="1" w:styleId="DefaultParagraphFont">
     <w:name w:val="Default Paragraph Font"/>
     <w:uiPriority w:val="1"/>
-    <w:semiHidden/>
     <w:unhideWhenUsed/>
   </w:style>
   <w:style w:type="table" w:default="1" w:styleId="TableNormal">

</xml_diff>